<commit_message>
Jarvise Bağlantı kodu yazıldı pasif kaldı
</commit_message>
<xml_diff>
--- a/Home Rapor.docx
+++ b/Home Rapor.docx
@@ -29,1080 +29,1607 @@
           <w:b/>
           <w:bCs/>
         </w:rPr>
-        <w:t>1. Proje Tanıtımı</w:t>
-      </w:r>
-    </w:p>
-    <w:p>
-      <w:r>
-        <w:t>Home Asistan, akıllı ev sistemlerini merkezi bir yapı altında yönetmek amacıyla geliştirilen web ve mobil destekli bir ev otomasyon platformudur. Kullanıcıların evlerindeki cihazları tek panel üzerinden kontrol etmesini, durumlarını izlemesini ve çeşitli otomasyon senaryoları oluşturmasını hedeflemektedir.</w:t>
-      </w:r>
-    </w:p>
-    <w:p>
-      <w:r>
-        <w:t>Proje; modern yazılım geliştirme prensipleri kullanılarak ölçeklenebilir, güvenli ve kullanıcı dostu olacak şekilde tasarlanmıştır.</w:t>
-      </w:r>
-    </w:p>
-    <w:p>
-      <w:r>
-        <w:pict w14:anchorId="286229EB">
-          <v:rect id="_x0000_i1073" style="width:0;height:1.5pt" o:hralign="center" o:hrstd="t" o:hr="t" fillcolor="#a0a0a0" stroked="f"/>
-        </w:pict>
-      </w:r>
-    </w:p>
-    <w:p>
-      <w:pPr>
-        <w:rPr>
-          <w:b/>
-          <w:bCs/>
-        </w:rPr>
-      </w:pPr>
-      <w:r>
-        <w:rPr>
-          <w:b/>
-          <w:bCs/>
-        </w:rPr>
-        <w:t>2. Projenin Amacı</w:t>
-      </w:r>
-    </w:p>
-    <w:p>
-      <w:r>
-        <w:t>Bu projenin temel amacı;</w:t>
+        <w:t>1. Proje Adı</w:t>
+      </w:r>
+    </w:p>
+    <w:p>
+      <w:pPr>
+        <w:rPr>
+          <w:b/>
+          <w:bCs/>
+        </w:rPr>
+      </w:pPr>
+      <w:r>
+        <w:rPr>
+          <w:b/>
+          <w:bCs/>
+        </w:rPr>
+        <w:t>Home Asistan</w:t>
+      </w:r>
+    </w:p>
+    <w:p>
+      <w:pPr>
+        <w:rPr>
+          <w:b/>
+          <w:bCs/>
+        </w:rPr>
+      </w:pPr>
+      <w:r>
+        <w:rPr>
+          <w:b/>
+          <w:bCs/>
+        </w:rPr>
+        <w:t>2. Proje Amacı</w:t>
+      </w:r>
+    </w:p>
+    <w:p>
+      <w:pPr>
+        <w:rPr>
+          <w:b/>
+          <w:bCs/>
+        </w:rPr>
+      </w:pPr>
+      <w:r>
+        <w:rPr>
+          <w:b/>
+          <w:bCs/>
+        </w:rPr>
+        <w:t>Home Asistan, kullanıcıların evlerinde bulunan akıllı cihazları tek bir merkezden yönetebilmesini sağlayan web ve mobil uyumlu bir otomasyon sistemidir. Proje, cihazların kontrol edilmesi, durumlarının izlenmesi ve kullanıcı dostu bir arayüz üzerinden yönetilmesini amaçlamaktadır.</w:t>
+      </w:r>
+    </w:p>
+    <w:p>
+      <w:pPr>
+        <w:rPr>
+          <w:b/>
+          <w:bCs/>
+        </w:rPr>
+      </w:pPr>
+      <w:r>
+        <w:rPr>
+          <w:b/>
+          <w:bCs/>
+        </w:rPr>
+        <w:t>3. Proje Kapsamı</w:t>
+      </w:r>
+    </w:p>
+    <w:p>
+      <w:pPr>
+        <w:rPr>
+          <w:b/>
+          <w:bCs/>
+        </w:rPr>
+      </w:pPr>
+      <w:r>
+        <w:rPr>
+          <w:b/>
+          <w:bCs/>
+        </w:rPr>
+        <w:t>Sistem aşağıdaki temel modüllerden oluşmaktadır:</w:t>
       </w:r>
     </w:p>
     <w:p>
       <w:pPr>
         <w:numPr>
           <w:ilvl w:val="0"/>
-          <w:numId w:val="1"/>
+          <w:numId w:val="15"/>
         </w:numPr>
-      </w:pPr>
-      <w:r>
-        <w:t>Akıllı ev cihazlarını tek noktadan yönetmek,</w:t>
+        <w:rPr>
+          <w:b/>
+          <w:bCs/>
+        </w:rPr>
+      </w:pPr>
+      <w:r>
+        <w:rPr>
+          <w:b/>
+          <w:bCs/>
+        </w:rPr>
+        <w:t>Kullanıcı kayıt ve giriş sistemi</w:t>
       </w:r>
     </w:p>
     <w:p>
       <w:pPr>
         <w:numPr>
           <w:ilvl w:val="0"/>
-          <w:numId w:val="1"/>
+          <w:numId w:val="15"/>
         </w:numPr>
-      </w:pPr>
-      <w:r>
-        <w:t>Kullanıcı deneyimini artırmak,</w:t>
+        <w:rPr>
+          <w:b/>
+          <w:bCs/>
+        </w:rPr>
+      </w:pPr>
+      <w:r>
+        <w:rPr>
+          <w:b/>
+          <w:bCs/>
+        </w:rPr>
+        <w:t>Yetkilendirme ve rol yönetimi</w:t>
       </w:r>
     </w:p>
     <w:p>
       <w:pPr>
         <w:numPr>
           <w:ilvl w:val="0"/>
-          <w:numId w:val="1"/>
+          <w:numId w:val="15"/>
         </w:numPr>
-      </w:pPr>
-      <w:r>
-        <w:t>Ev içi otomasyonu kolaylaştırmak,</w:t>
+        <w:rPr>
+          <w:b/>
+          <w:bCs/>
+        </w:rPr>
+      </w:pPr>
+      <w:r>
+        <w:rPr>
+          <w:b/>
+          <w:bCs/>
+        </w:rPr>
+        <w:t>Cihaz yönetim paneli</w:t>
       </w:r>
     </w:p>
     <w:p>
       <w:pPr>
         <w:numPr>
           <w:ilvl w:val="0"/>
-          <w:numId w:val="1"/>
+          <w:numId w:val="15"/>
         </w:numPr>
-      </w:pPr>
-      <w:r>
-        <w:t>Gerçek zamanlı cihaz takibi sağlamak,</w:t>
+        <w:rPr>
+          <w:b/>
+          <w:bCs/>
+        </w:rPr>
+      </w:pPr>
+      <w:r>
+        <w:rPr>
+          <w:b/>
+          <w:bCs/>
+        </w:rPr>
+        <w:t>Durum izleme ekranları</w:t>
       </w:r>
     </w:p>
     <w:p>
       <w:pPr>
         <w:numPr>
           <w:ilvl w:val="0"/>
-          <w:numId w:val="1"/>
+          <w:numId w:val="15"/>
         </w:numPr>
-      </w:pPr>
-      <w:r>
-        <w:t>Mobil ve web platformlarından erişim sunmaktır.</w:t>
-      </w:r>
-    </w:p>
-    <w:p>
-      <w:r>
-        <w:pict w14:anchorId="58EEE221">
-          <v:rect id="_x0000_i1074" style="width:0;height:1.5pt" o:hralign="center" o:hrstd="t" o:hr="t" fillcolor="#a0a0a0" stroked="f"/>
-        </w:pict>
-      </w:r>
-    </w:p>
-    <w:p>
-      <w:pPr>
-        <w:rPr>
-          <w:b/>
-          <w:bCs/>
-        </w:rPr>
-      </w:pPr>
-      <w:r>
-        <w:rPr>
-          <w:b/>
-          <w:bCs/>
-        </w:rPr>
-        <w:t>3. Kullanılan Teknolojiler</w:t>
-      </w:r>
-    </w:p>
-    <w:p>
-      <w:pPr>
-        <w:rPr>
-          <w:b/>
-          <w:bCs/>
-        </w:rPr>
-      </w:pPr>
-      <w:r>
-        <w:rPr>
-          <w:b/>
-          <w:bCs/>
-        </w:rPr>
-        <w:t>Backend</w:t>
+        <w:rPr>
+          <w:b/>
+          <w:bCs/>
+        </w:rPr>
+      </w:pPr>
+      <w:r>
+        <w:rPr>
+          <w:b/>
+          <w:bCs/>
+        </w:rPr>
+        <w:t>Bildirim sistemi</w:t>
       </w:r>
     </w:p>
     <w:p>
       <w:pPr>
         <w:numPr>
           <w:ilvl w:val="0"/>
-          <w:numId w:val="2"/>
+          <w:numId w:val="15"/>
         </w:numPr>
-      </w:pPr>
-      <w:r>
-        <w:t xml:space="preserve">ASP.NET </w:t>
-      </w:r>
-      <w:proofErr w:type="spellStart"/>
-      <w:r>
-        <w:t>Core</w:t>
-      </w:r>
-      <w:proofErr w:type="spellEnd"/>
+        <w:rPr>
+          <w:b/>
+          <w:bCs/>
+        </w:rPr>
+      </w:pPr>
+      <w:r>
+        <w:rPr>
+          <w:b/>
+          <w:bCs/>
+        </w:rPr>
+        <w:t>Mobil uyumlu arayüz</w:t>
+      </w:r>
     </w:p>
     <w:p>
       <w:pPr>
         <w:numPr>
           <w:ilvl w:val="0"/>
-          <w:numId w:val="2"/>
+          <w:numId w:val="15"/>
         </w:numPr>
-      </w:pPr>
-      <w:r>
-        <w:t>C#</w:t>
+        <w:rPr>
+          <w:b/>
+          <w:bCs/>
+        </w:rPr>
+      </w:pPr>
+      <w:r>
+        <w:rPr>
+          <w:b/>
+          <w:bCs/>
+        </w:rPr>
+        <w:t>Yönetici paneli</w:t>
       </w:r>
     </w:p>
     <w:p>
       <w:pPr>
         <w:numPr>
           <w:ilvl w:val="0"/>
-          <w:numId w:val="2"/>
+          <w:numId w:val="15"/>
         </w:numPr>
-      </w:pPr>
-      <w:r>
-        <w:t>REST API</w:t>
-      </w:r>
-    </w:p>
-    <w:p>
-      <w:pPr>
-        <w:rPr>
-          <w:b/>
-          <w:bCs/>
-        </w:rPr>
-      </w:pPr>
-      <w:proofErr w:type="spellStart"/>
-      <w:r>
-        <w:rPr>
-          <w:b/>
-          <w:bCs/>
-        </w:rPr>
-        <w:t>Veritabanı</w:t>
-      </w:r>
-      <w:proofErr w:type="spellEnd"/>
+        <w:rPr>
+          <w:b/>
+          <w:bCs/>
+        </w:rPr>
+      </w:pPr>
+      <w:r>
+        <w:rPr>
+          <w:b/>
+          <w:bCs/>
+        </w:rPr>
+        <w:t>İletişim ve destek sistemi</w:t>
+      </w:r>
     </w:p>
     <w:p>
       <w:pPr>
         <w:numPr>
           <w:ilvl w:val="0"/>
-          <w:numId w:val="3"/>
+          <w:numId w:val="15"/>
         </w:numPr>
-      </w:pPr>
-      <w:r>
-        <w:t>Microsoft SQL Server</w:t>
-      </w:r>
-    </w:p>
-    <w:p>
-      <w:pPr>
-        <w:rPr>
-          <w:b/>
-          <w:bCs/>
-        </w:rPr>
-      </w:pPr>
-      <w:r>
-        <w:rPr>
-          <w:b/>
-          <w:bCs/>
-        </w:rPr>
-        <w:t>Frontend</w:t>
+        <w:rPr>
+          <w:b/>
+          <w:bCs/>
+        </w:rPr>
+      </w:pPr>
+      <w:r>
+        <w:rPr>
+          <w:b/>
+          <w:bCs/>
+        </w:rPr>
+        <w:t>Veritabanı yönetimi</w:t>
+      </w:r>
+    </w:p>
+    <w:p>
+      <w:pPr>
+        <w:rPr>
+          <w:b/>
+          <w:bCs/>
+        </w:rPr>
+      </w:pPr>
+      <w:r>
+        <w:rPr>
+          <w:b/>
+          <w:bCs/>
+        </w:rPr>
+        <w:t>4. Kullanılan Teknolojiler</w:t>
+      </w:r>
+    </w:p>
+    <w:p>
+      <w:pPr>
+        <w:rPr>
+          <w:b/>
+          <w:bCs/>
+        </w:rPr>
+      </w:pPr>
+      <w:r>
+        <w:rPr>
+          <w:b/>
+          <w:bCs/>
+        </w:rPr>
+        <w:t>Backend</w:t>
       </w:r>
     </w:p>
     <w:p>
       <w:pPr>
         <w:numPr>
           <w:ilvl w:val="0"/>
-          <w:numId w:val="4"/>
+          <w:numId w:val="16"/>
         </w:numPr>
-      </w:pPr>
-      <w:r>
-        <w:t>HTML5</w:t>
+        <w:rPr>
+          <w:b/>
+          <w:bCs/>
+        </w:rPr>
+      </w:pPr>
+      <w:r>
+        <w:rPr>
+          <w:b/>
+          <w:bCs/>
+        </w:rPr>
+        <w:t>ASP.NET</w:t>
       </w:r>
     </w:p>
     <w:p>
       <w:pPr>
         <w:numPr>
           <w:ilvl w:val="0"/>
-          <w:numId w:val="4"/>
+          <w:numId w:val="16"/>
         </w:numPr>
-      </w:pPr>
-      <w:r>
-        <w:t>CSS3</w:t>
+        <w:rPr>
+          <w:b/>
+          <w:bCs/>
+        </w:rPr>
+      </w:pPr>
+      <w:r>
+        <w:rPr>
+          <w:b/>
+          <w:bCs/>
+        </w:rPr>
+        <w:t>C#</w:t>
       </w:r>
     </w:p>
     <w:p>
       <w:pPr>
         <w:numPr>
           <w:ilvl w:val="0"/>
-          <w:numId w:val="4"/>
+          <w:numId w:val="16"/>
         </w:numPr>
-      </w:pPr>
-      <w:r>
-        <w:t>JavaScript</w:t>
-      </w:r>
-    </w:p>
-    <w:p>
-      <w:pPr>
-        <w:rPr>
-          <w:b/>
-          <w:bCs/>
-        </w:rPr>
-      </w:pPr>
-      <w:r>
-        <w:rPr>
-          <w:b/>
-          <w:bCs/>
-        </w:rPr>
-        <w:t>Mobil Uygulama</w:t>
+        <w:rPr>
+          <w:b/>
+          <w:bCs/>
+        </w:rPr>
+      </w:pPr>
+      <w:r>
+        <w:rPr>
+          <w:b/>
+          <w:bCs/>
+        </w:rPr>
+        <w:t>REST API</w:t>
       </w:r>
     </w:p>
     <w:p>
       <w:pPr>
         <w:numPr>
           <w:ilvl w:val="0"/>
-          <w:numId w:val="5"/>
+          <w:numId w:val="16"/>
         </w:numPr>
-      </w:pPr>
-      <w:r>
-        <w:lastRenderedPageBreak/>
-        <w:t>Android Tabanlı İstemci</w:t>
-      </w:r>
-    </w:p>
-    <w:p>
-      <w:pPr>
-        <w:rPr>
-          <w:b/>
-          <w:bCs/>
-        </w:rPr>
-      </w:pPr>
-      <w:r>
-        <w:rPr>
-          <w:b/>
-          <w:bCs/>
-        </w:rPr>
-        <w:t>Diğer Teknolojiler</w:t>
+        <w:rPr>
+          <w:b/>
+          <w:bCs/>
+        </w:rPr>
+      </w:pPr>
+      <w:r>
+        <w:rPr>
+          <w:b/>
+          <w:bCs/>
+        </w:rPr>
+        <w:t>SQL Server</w:t>
+      </w:r>
+    </w:p>
+    <w:p>
+      <w:pPr>
+        <w:rPr>
+          <w:b/>
+          <w:bCs/>
+        </w:rPr>
+      </w:pPr>
+      <w:r>
+        <w:rPr>
+          <w:b/>
+          <w:bCs/>
+        </w:rPr>
+        <w:t>Frontend</w:t>
       </w:r>
     </w:p>
     <w:p>
       <w:pPr>
         <w:numPr>
           <w:ilvl w:val="0"/>
-          <w:numId w:val="6"/>
+          <w:numId w:val="17"/>
         </w:numPr>
-      </w:pPr>
-      <w:r>
-        <w:t>JSON Veri Transferi</w:t>
+        <w:rPr>
+          <w:b/>
+          <w:bCs/>
+        </w:rPr>
+      </w:pPr>
+      <w:r>
+        <w:rPr>
+          <w:b/>
+          <w:bCs/>
+        </w:rPr>
+        <w:t>HTML5</w:t>
       </w:r>
     </w:p>
     <w:p>
       <w:pPr>
         <w:numPr>
           <w:ilvl w:val="0"/>
-          <w:numId w:val="6"/>
+          <w:numId w:val="17"/>
         </w:numPr>
-      </w:pPr>
-      <w:r>
-        <w:t>JWT Kimlik Doğrulama</w:t>
+        <w:rPr>
+          <w:b/>
+          <w:bCs/>
+        </w:rPr>
+      </w:pPr>
+      <w:r>
+        <w:rPr>
+          <w:b/>
+          <w:bCs/>
+        </w:rPr>
+        <w:t>CSS3</w:t>
       </w:r>
     </w:p>
     <w:p>
       <w:pPr>
         <w:numPr>
           <w:ilvl w:val="0"/>
-          <w:numId w:val="6"/>
+          <w:numId w:val="17"/>
         </w:numPr>
-      </w:pPr>
-      <w:proofErr w:type="spellStart"/>
-      <w:r>
-        <w:t>SignalR</w:t>
-      </w:r>
-      <w:proofErr w:type="spellEnd"/>
-      <w:r>
-        <w:t xml:space="preserve"> (Gerçek Zamanlı Bildirimler için planlanabilir)</w:t>
+        <w:rPr>
+          <w:b/>
+          <w:bCs/>
+        </w:rPr>
+      </w:pPr>
+      <w:r>
+        <w:rPr>
+          <w:b/>
+          <w:bCs/>
+        </w:rPr>
+        <w:t>JavaScript</w:t>
+      </w:r>
+    </w:p>
+    <w:p>
+      <w:pPr>
+        <w:rPr>
+          <w:b/>
+          <w:bCs/>
+        </w:rPr>
+      </w:pPr>
+      <w:r>
+        <w:rPr>
+          <w:b/>
+          <w:bCs/>
+        </w:rPr>
+        <w:lastRenderedPageBreak/>
+        <w:t>Veritabanı</w:t>
       </w:r>
     </w:p>
     <w:p>
       <w:pPr>
         <w:numPr>
           <w:ilvl w:val="0"/>
-          <w:numId w:val="6"/>
+          <w:numId w:val="18"/>
         </w:numPr>
-      </w:pPr>
-      <w:r>
-        <w:t xml:space="preserve">Git ve </w:t>
-      </w:r>
-      <w:proofErr w:type="spellStart"/>
-      <w:r>
-        <w:t>GitHub</w:t>
-      </w:r>
-      <w:proofErr w:type="spellEnd"/>
-      <w:r>
-        <w:t xml:space="preserve"> Versiyon Kontrolü</w:t>
-      </w:r>
-    </w:p>
-    <w:p>
-      <w:r>
-        <w:pict w14:anchorId="5F65E9F2">
-          <v:rect id="_x0000_i1075" style="width:0;height:1.5pt" o:hralign="center" o:hrstd="t" o:hr="t" fillcolor="#a0a0a0" stroked="f"/>
-        </w:pict>
-      </w:r>
-    </w:p>
-    <w:p>
-      <w:pPr>
-        <w:rPr>
-          <w:b/>
-          <w:bCs/>
-        </w:rPr>
-      </w:pPr>
-      <w:r>
-        <w:rPr>
-          <w:b/>
-          <w:bCs/>
-        </w:rPr>
-        <w:t>4. Sistem Mimarisi</w:t>
-      </w:r>
-    </w:p>
-    <w:p>
-      <w:r>
-        <w:t>Sistem temel olarak üç katmandan oluşmaktadır:</w:t>
-      </w:r>
-    </w:p>
-    <w:p>
-      <w:pPr>
-        <w:rPr>
-          <w:b/>
-          <w:bCs/>
-        </w:rPr>
-      </w:pPr>
-      <w:r>
-        <w:rPr>
-          <w:b/>
-          <w:bCs/>
-        </w:rPr>
-        <w:t>Sunucu Katmanı</w:t>
-      </w:r>
-    </w:p>
-    <w:p>
-      <w:r>
-        <w:t xml:space="preserve">Kullanıcı işlemleri, cihaz yönetimi ve </w:t>
-      </w:r>
-      <w:proofErr w:type="spellStart"/>
-      <w:r>
-        <w:t>veritabanı</w:t>
-      </w:r>
-      <w:proofErr w:type="spellEnd"/>
-      <w:r>
-        <w:t xml:space="preserve"> erişimi burada gerçekleştirilir.</w:t>
-      </w:r>
-    </w:p>
-    <w:p>
-      <w:pPr>
-        <w:rPr>
-          <w:b/>
-          <w:bCs/>
-        </w:rPr>
-      </w:pPr>
-      <w:proofErr w:type="spellStart"/>
-      <w:r>
-        <w:rPr>
-          <w:b/>
-          <w:bCs/>
-        </w:rPr>
-        <w:t>Veritabanı</w:t>
-      </w:r>
-      <w:proofErr w:type="spellEnd"/>
-      <w:r>
-        <w:rPr>
-          <w:b/>
-          <w:bCs/>
-        </w:rPr>
-        <w:t xml:space="preserve"> Katmanı</w:t>
-      </w:r>
-    </w:p>
-    <w:p>
-      <w:r>
-        <w:t>Kullanıcı bilgileri, cihaz verileri, log kayıtları ve sistem ayarları burada tutulur.</w:t>
-      </w:r>
-    </w:p>
-    <w:p>
-      <w:pPr>
-        <w:rPr>
-          <w:b/>
-          <w:bCs/>
-        </w:rPr>
-      </w:pPr>
-      <w:r>
-        <w:rPr>
-          <w:b/>
-          <w:bCs/>
-        </w:rPr>
-        <w:t>İstemci Katmanı</w:t>
-      </w:r>
-    </w:p>
-    <w:p>
-      <w:r>
-        <w:t>Web paneli ve mobil uygulama üzerinden kullanıcılar sisteme erişebilir.</w:t>
-      </w:r>
-    </w:p>
-    <w:p>
-      <w:r>
-        <w:pict w14:anchorId="63CCE093">
-          <v:rect id="_x0000_i1076" style="width:0;height:1.5pt" o:hralign="center" o:hrstd="t" o:hr="t" fillcolor="#a0a0a0" stroked="f"/>
-        </w:pict>
-      </w:r>
-    </w:p>
-    <w:p>
-      <w:pPr>
-        <w:rPr>
-          <w:b/>
-          <w:bCs/>
-        </w:rPr>
-      </w:pPr>
-      <w:r>
-        <w:rPr>
-          <w:b/>
-          <w:bCs/>
-        </w:rPr>
-        <w:t>5. Temel Özellikler</w:t>
-      </w:r>
-    </w:p>
-    <w:p>
-      <w:pPr>
-        <w:rPr>
-          <w:b/>
-          <w:bCs/>
-        </w:rPr>
-      </w:pPr>
-      <w:r>
-        <w:rPr>
-          <w:b/>
-          <w:bCs/>
-        </w:rPr>
-        <w:t>Kullanıcı Yönetimi</w:t>
+        <w:rPr>
+          <w:b/>
+          <w:bCs/>
+        </w:rPr>
+      </w:pPr>
+      <w:r>
+        <w:rPr>
+          <w:b/>
+          <w:bCs/>
+        </w:rPr>
+        <w:t>Microsoft SQL Server</w:t>
+      </w:r>
+    </w:p>
+    <w:p>
+      <w:pPr>
+        <w:rPr>
+          <w:b/>
+          <w:bCs/>
+        </w:rPr>
+      </w:pPr>
+      <w:r>
+        <w:rPr>
+          <w:b/>
+          <w:bCs/>
+        </w:rPr>
+        <w:t>Versiyon Kontrol</w:t>
       </w:r>
     </w:p>
     <w:p>
       <w:pPr>
         <w:numPr>
           <w:ilvl w:val="0"/>
-          <w:numId w:val="7"/>
+          <w:numId w:val="19"/>
         </w:numPr>
-      </w:pPr>
-      <w:r>
-        <w:t>Kayıt olma</w:t>
+        <w:rPr>
+          <w:b/>
+          <w:bCs/>
+        </w:rPr>
+      </w:pPr>
+      <w:r>
+        <w:rPr>
+          <w:b/>
+          <w:bCs/>
+        </w:rPr>
+        <w:t>Git</w:t>
       </w:r>
     </w:p>
     <w:p>
       <w:pPr>
         <w:numPr>
           <w:ilvl w:val="0"/>
-          <w:numId w:val="7"/>
+          <w:numId w:val="19"/>
         </w:numPr>
-      </w:pPr>
-      <w:r>
-        <w:t>Giriş yapma</w:t>
+        <w:rPr>
+          <w:b/>
+          <w:bCs/>
+        </w:rPr>
+      </w:pPr>
+      <w:r>
+        <w:rPr>
+          <w:b/>
+          <w:bCs/>
+        </w:rPr>
+        <w:t>GitHub</w:t>
+      </w:r>
+    </w:p>
+    <w:p>
+      <w:pPr>
+        <w:rPr>
+          <w:b/>
+          <w:bCs/>
+        </w:rPr>
+      </w:pPr>
+      <w:r>
+        <w:rPr>
+          <w:b/>
+          <w:bCs/>
+        </w:rPr>
+        <w:t>5. Sistem Mimarisi</w:t>
+      </w:r>
+    </w:p>
+    <w:p>
+      <w:pPr>
+        <w:rPr>
+          <w:b/>
+          <w:bCs/>
+        </w:rPr>
+      </w:pPr>
+      <w:r>
+        <w:rPr>
+          <w:b/>
+          <w:bCs/>
+        </w:rPr>
+        <w:t>Home Asistan katmanlı mimari yapısına göre geliştirilmektedir.</w:t>
+      </w:r>
+    </w:p>
+    <w:p>
+      <w:pPr>
+        <w:rPr>
+          <w:b/>
+          <w:bCs/>
+        </w:rPr>
+      </w:pPr>
+      <w:r>
+        <w:rPr>
+          <w:b/>
+          <w:bCs/>
+        </w:rPr>
+        <w:t>Sunum Katmanı</w:t>
+      </w:r>
+    </w:p>
+    <w:p>
+      <w:pPr>
+        <w:rPr>
+          <w:b/>
+          <w:bCs/>
+        </w:rPr>
+      </w:pPr>
+      <w:r>
+        <w:rPr>
+          <w:b/>
+          <w:bCs/>
+        </w:rPr>
+        <w:t>Kullanıcı arayüzlerini içerir.</w:t>
+      </w:r>
+    </w:p>
+    <w:p>
+      <w:pPr>
+        <w:rPr>
+          <w:b/>
+          <w:bCs/>
+        </w:rPr>
+      </w:pPr>
+      <w:r>
+        <w:rPr>
+          <w:b/>
+          <w:bCs/>
+        </w:rPr>
+        <w:t>İş Mantığı Katmanı</w:t>
+      </w:r>
+    </w:p>
+    <w:p>
+      <w:pPr>
+        <w:rPr>
+          <w:b/>
+          <w:bCs/>
+        </w:rPr>
+      </w:pPr>
+      <w:r>
+        <w:rPr>
+          <w:b/>
+          <w:bCs/>
+        </w:rPr>
+        <w:t>Cihaz yönetimi, kullanıcı işlemleri ve sistem kurallarını yürütür.</w:t>
+      </w:r>
+    </w:p>
+    <w:p>
+      <w:pPr>
+        <w:rPr>
+          <w:b/>
+          <w:bCs/>
+        </w:rPr>
+      </w:pPr>
+      <w:r>
+        <w:rPr>
+          <w:b/>
+          <w:bCs/>
+        </w:rPr>
+        <w:t>Veri Erişim Katmanı</w:t>
+      </w:r>
+    </w:p>
+    <w:p>
+      <w:pPr>
+        <w:rPr>
+          <w:b/>
+          <w:bCs/>
+        </w:rPr>
+      </w:pPr>
+      <w:r>
+        <w:rPr>
+          <w:b/>
+          <w:bCs/>
+        </w:rPr>
+        <w:t>SQL Server ile veri alışverişini gerçekleştirir.</w:t>
+      </w:r>
+    </w:p>
+    <w:p>
+      <w:pPr>
+        <w:rPr>
+          <w:b/>
+          <w:bCs/>
+        </w:rPr>
+      </w:pPr>
+      <w:r>
+        <w:rPr>
+          <w:b/>
+          <w:bCs/>
+        </w:rPr>
+        <w:t>Veritabanı Katmanı</w:t>
+      </w:r>
+    </w:p>
+    <w:p>
+      <w:pPr>
+        <w:rPr>
+          <w:b/>
+          <w:bCs/>
+        </w:rPr>
+      </w:pPr>
+      <w:r>
+        <w:rPr>
+          <w:b/>
+          <w:bCs/>
+        </w:rPr>
+        <w:t>Kullanıcı, cihaz, bildirim ve sistem verilerini saklar.</w:t>
+      </w:r>
+    </w:p>
+    <w:p>
+      <w:pPr>
+        <w:rPr>
+          <w:b/>
+          <w:bCs/>
+        </w:rPr>
+      </w:pPr>
+      <w:r>
+        <w:rPr>
+          <w:b/>
+          <w:bCs/>
+        </w:rPr>
+        <w:t>6. Temel Özellikler</w:t>
+      </w:r>
+    </w:p>
+    <w:p>
+      <w:pPr>
+        <w:rPr>
+          <w:b/>
+          <w:bCs/>
+        </w:rPr>
+      </w:pPr>
+      <w:r>
+        <w:rPr>
+          <w:b/>
+          <w:bCs/>
+        </w:rPr>
+        <w:t>Kullanıcı Yönetimi</w:t>
       </w:r>
     </w:p>
     <w:p>
       <w:pPr>
         <w:numPr>
           <w:ilvl w:val="0"/>
-          <w:numId w:val="7"/>
+          <w:numId w:val="20"/>
         </w:numPr>
-      </w:pPr>
-      <w:r>
-        <w:t>Profil yönetimi</w:t>
-      </w:r>
-    </w:p>
-    <w:p>
-      <w:pPr>
-        <w:rPr>
-          <w:b/>
-          <w:bCs/>
-        </w:rPr>
-      </w:pPr>
-      <w:r>
-        <w:rPr>
-          <w:b/>
-          <w:bCs/>
-        </w:rPr>
-        <w:t>Cihaz Yönetimi</w:t>
+        <w:rPr>
+          <w:b/>
+          <w:bCs/>
+        </w:rPr>
+      </w:pPr>
+      <w:r>
+        <w:rPr>
+          <w:b/>
+          <w:bCs/>
+        </w:rPr>
+        <w:t>Kayıt olma</w:t>
       </w:r>
     </w:p>
     <w:p>
       <w:pPr>
         <w:numPr>
           <w:ilvl w:val="0"/>
-          <w:numId w:val="8"/>
+          <w:numId w:val="20"/>
         </w:numPr>
-      </w:pPr>
-      <w:r>
-        <w:t>Cihaz ekleme</w:t>
+        <w:rPr>
+          <w:b/>
+          <w:bCs/>
+        </w:rPr>
+      </w:pPr>
+      <w:r>
+        <w:rPr>
+          <w:b/>
+          <w:bCs/>
+        </w:rPr>
+        <w:t>Giriş yapma</w:t>
       </w:r>
     </w:p>
     <w:p>
       <w:pPr>
         <w:numPr>
           <w:ilvl w:val="0"/>
-          <w:numId w:val="8"/>
+          <w:numId w:val="20"/>
         </w:numPr>
-      </w:pPr>
-      <w:r>
-        <w:t>Cihaz silme</w:t>
+        <w:rPr>
+          <w:b/>
+          <w:bCs/>
+        </w:rPr>
+      </w:pPr>
+      <w:r>
+        <w:rPr>
+          <w:b/>
+          <w:bCs/>
+        </w:rPr>
+        <w:t>Profil düzenleme</w:t>
       </w:r>
     </w:p>
     <w:p>
       <w:pPr>
         <w:numPr>
           <w:ilvl w:val="0"/>
-          <w:numId w:val="8"/>
+          <w:numId w:val="20"/>
         </w:numPr>
-      </w:pPr>
-      <w:r>
-        <w:t>Cihaz durumu görüntüleme</w:t>
+        <w:rPr>
+          <w:b/>
+          <w:bCs/>
+        </w:rPr>
+      </w:pPr>
+      <w:r>
+        <w:rPr>
+          <w:b/>
+          <w:bCs/>
+        </w:rPr>
+        <w:t>Şifre güncelleme</w:t>
+      </w:r>
+    </w:p>
+    <w:p>
+      <w:pPr>
+        <w:rPr>
+          <w:b/>
+          <w:bCs/>
+        </w:rPr>
+      </w:pPr>
+      <w:r>
+        <w:rPr>
+          <w:b/>
+          <w:bCs/>
+        </w:rPr>
+        <w:t>Cihaz Yönetimi</w:t>
       </w:r>
     </w:p>
     <w:p>
       <w:pPr>
         <w:numPr>
           <w:ilvl w:val="0"/>
-          <w:numId w:val="8"/>
+          <w:numId w:val="21"/>
         </w:numPr>
-      </w:pPr>
-      <w:r>
-        <w:t>Cihaz kontrol işlemleri</w:t>
-      </w:r>
-    </w:p>
-    <w:p>
-      <w:pPr>
-        <w:rPr>
-          <w:b/>
-          <w:bCs/>
-        </w:rPr>
-      </w:pPr>
-      <w:r>
-        <w:rPr>
-          <w:b/>
-          <w:bCs/>
-        </w:rPr>
-        <w:t>Yönetim Paneli</w:t>
+        <w:rPr>
+          <w:b/>
+          <w:bCs/>
+        </w:rPr>
+      </w:pPr>
+      <w:r>
+        <w:rPr>
+          <w:b/>
+          <w:bCs/>
+        </w:rPr>
+        <w:t>Yeni cihaz ekleme</w:t>
       </w:r>
     </w:p>
     <w:p>
       <w:pPr>
         <w:numPr>
           <w:ilvl w:val="0"/>
-          <w:numId w:val="9"/>
+          <w:numId w:val="21"/>
         </w:numPr>
-      </w:pPr>
-      <w:r>
-        <w:t>Sistem takibi</w:t>
+        <w:rPr>
+          <w:b/>
+          <w:bCs/>
+        </w:rPr>
+      </w:pPr>
+      <w:r>
+        <w:rPr>
+          <w:b/>
+          <w:bCs/>
+        </w:rPr>
+        <w:t>Cihaz silme</w:t>
       </w:r>
     </w:p>
     <w:p>
       <w:pPr>
         <w:numPr>
           <w:ilvl w:val="0"/>
-          <w:numId w:val="9"/>
+          <w:numId w:val="21"/>
         </w:numPr>
-      </w:pPr>
-      <w:r>
-        <w:lastRenderedPageBreak/>
-        <w:t>Kullanıcı yönetimi</w:t>
+        <w:rPr>
+          <w:b/>
+          <w:bCs/>
+        </w:rPr>
+      </w:pPr>
+      <w:r>
+        <w:rPr>
+          <w:b/>
+          <w:bCs/>
+        </w:rPr>
+        <w:t>Cihaz güncelleme</w:t>
       </w:r>
     </w:p>
     <w:p>
       <w:pPr>
         <w:numPr>
           <w:ilvl w:val="0"/>
-          <w:numId w:val="9"/>
+          <w:numId w:val="21"/>
         </w:numPr>
-      </w:pPr>
-      <w:r>
-        <w:t>Log görüntüleme</w:t>
-      </w:r>
-    </w:p>
-    <w:p>
-      <w:pPr>
-        <w:rPr>
-          <w:b/>
-          <w:bCs/>
-        </w:rPr>
-      </w:pPr>
-      <w:r>
-        <w:rPr>
-          <w:b/>
-          <w:bCs/>
-        </w:rPr>
-        <w:t>Bildirim Sistemi</w:t>
+        <w:rPr>
+          <w:b/>
+          <w:bCs/>
+        </w:rPr>
+      </w:pPr>
+      <w:r>
+        <w:rPr>
+          <w:b/>
+          <w:bCs/>
+        </w:rPr>
+        <w:t>Cihaz durumu görüntüleme</w:t>
+      </w:r>
+    </w:p>
+    <w:p>
+      <w:pPr>
+        <w:rPr>
+          <w:b/>
+          <w:bCs/>
+        </w:rPr>
+      </w:pPr>
+      <w:r>
+        <w:rPr>
+          <w:b/>
+          <w:bCs/>
+        </w:rPr>
+        <w:t>Yönetici İşlemleri</w:t>
       </w:r>
     </w:p>
     <w:p>
       <w:pPr>
         <w:numPr>
           <w:ilvl w:val="0"/>
-          <w:numId w:val="10"/>
+          <w:numId w:val="22"/>
         </w:numPr>
-      </w:pPr>
-      <w:r>
-        <w:t>Durum değişikliği bildirimleri</w:t>
+        <w:rPr>
+          <w:b/>
+          <w:bCs/>
+        </w:rPr>
+      </w:pPr>
+      <w:r>
+        <w:rPr>
+          <w:b/>
+          <w:bCs/>
+        </w:rPr>
+        <w:t>Kullanıcı yönetimi</w:t>
       </w:r>
     </w:p>
     <w:p>
       <w:pPr>
         <w:numPr>
           <w:ilvl w:val="0"/>
-          <w:numId w:val="10"/>
+          <w:numId w:val="22"/>
         </w:numPr>
-      </w:pPr>
-      <w:r>
-        <w:t>Sistem uyarıları</w:t>
-      </w:r>
-    </w:p>
-    <w:p>
-      <w:pPr>
-        <w:rPr>
-          <w:b/>
-          <w:bCs/>
-        </w:rPr>
-      </w:pPr>
-      <w:r>
-        <w:rPr>
-          <w:b/>
-          <w:bCs/>
-        </w:rPr>
-        <w:t>Arkadaş Sistemi (Planlanan/Geliştirilen)</w:t>
+        <w:rPr>
+          <w:b/>
+          <w:bCs/>
+        </w:rPr>
+      </w:pPr>
+      <w:r>
+        <w:rPr>
+          <w:b/>
+          <w:bCs/>
+        </w:rPr>
+        <w:lastRenderedPageBreak/>
+        <w:t>Sistem mesajlarını görüntüleme</w:t>
       </w:r>
     </w:p>
     <w:p>
       <w:pPr>
         <w:numPr>
           <w:ilvl w:val="0"/>
-          <w:numId w:val="11"/>
+          <w:numId w:val="22"/>
         </w:numPr>
-      </w:pPr>
-      <w:r>
-        <w:t>Arkadaş ekleme</w:t>
+        <w:rPr>
+          <w:b/>
+          <w:bCs/>
+        </w:rPr>
+      </w:pPr>
+      <w:r>
+        <w:rPr>
+          <w:b/>
+          <w:bCs/>
+        </w:rPr>
+        <w:t>İçerik kontrolü</w:t>
       </w:r>
     </w:p>
     <w:p>
       <w:pPr>
         <w:numPr>
           <w:ilvl w:val="0"/>
-          <w:numId w:val="11"/>
+          <w:numId w:val="22"/>
         </w:numPr>
-      </w:pPr>
-      <w:r>
-        <w:t>Arkadaşlık isteği kabul etme</w:t>
+        <w:rPr>
+          <w:b/>
+          <w:bCs/>
+        </w:rPr>
+      </w:pPr>
+      <w:r>
+        <w:rPr>
+          <w:b/>
+          <w:bCs/>
+        </w:rPr>
+        <w:t>Yetki yönetimi</w:t>
+      </w:r>
+    </w:p>
+    <w:p>
+      <w:pPr>
+        <w:rPr>
+          <w:b/>
+          <w:bCs/>
+        </w:rPr>
+      </w:pPr>
+      <w:r>
+        <w:rPr>
+          <w:b/>
+          <w:bCs/>
+        </w:rPr>
+        <w:t>Bildirim Sistemi</w:t>
       </w:r>
     </w:p>
     <w:p>
       <w:pPr>
         <w:numPr>
           <w:ilvl w:val="0"/>
-          <w:numId w:val="11"/>
+          <w:numId w:val="23"/>
         </w:numPr>
-      </w:pPr>
-      <w:r>
-        <w:t>Arkadaşlık isteği reddetme</w:t>
+        <w:rPr>
+          <w:b/>
+          <w:bCs/>
+        </w:rPr>
+      </w:pPr>
+      <w:r>
+        <w:rPr>
+          <w:b/>
+          <w:bCs/>
+        </w:rPr>
+        <w:t>Sistem bildirimleri</w:t>
       </w:r>
     </w:p>
     <w:p>
       <w:pPr>
         <w:numPr>
           <w:ilvl w:val="0"/>
-          <w:numId w:val="11"/>
+          <w:numId w:val="23"/>
         </w:numPr>
-      </w:pPr>
-      <w:r>
-        <w:t>Arkadaş listesi görüntüleme</w:t>
-      </w:r>
-    </w:p>
-    <w:p>
-      <w:r>
-        <w:pict w14:anchorId="45D04450">
-          <v:rect id="_x0000_i1077" style="width:0;height:1.5pt" o:hralign="center" o:hrstd="t" o:hr="t" fillcolor="#a0a0a0" stroked="f"/>
-        </w:pict>
-      </w:r>
-    </w:p>
-    <w:p>
-      <w:pPr>
-        <w:rPr>
-          <w:b/>
-          <w:bCs/>
-        </w:rPr>
-      </w:pPr>
-      <w:r>
-        <w:rPr>
-          <w:b/>
-          <w:bCs/>
-        </w:rPr>
-        <w:t>6. Güvenlik Yapısı</w:t>
-      </w:r>
-    </w:p>
-    <w:p>
-      <w:r>
-        <w:t>Projede aşağıdaki güvenlik önlemlerinin uygulanması hedeflenmektedir:</w:t>
+        <w:rPr>
+          <w:b/>
+          <w:bCs/>
+        </w:rPr>
+      </w:pPr>
+      <w:r>
+        <w:rPr>
+          <w:b/>
+          <w:bCs/>
+        </w:rPr>
+        <w:t>Cihaz durum uyarıları</w:t>
       </w:r>
     </w:p>
     <w:p>
       <w:pPr>
         <w:numPr>
           <w:ilvl w:val="0"/>
-          <w:numId w:val="12"/>
+          <w:numId w:val="23"/>
         </w:numPr>
-      </w:pPr>
-      <w:r>
-        <w:t>JWT tabanlı kimlik doğrulama</w:t>
+        <w:rPr>
+          <w:b/>
+          <w:bCs/>
+        </w:rPr>
+      </w:pPr>
+      <w:r>
+        <w:rPr>
+          <w:b/>
+          <w:bCs/>
+        </w:rPr>
+        <w:t>Kullanıcı bilgilendirmeleri</w:t>
+      </w:r>
+    </w:p>
+    <w:p>
+      <w:pPr>
+        <w:rPr>
+          <w:b/>
+          <w:bCs/>
+        </w:rPr>
+      </w:pPr>
+      <w:r>
+        <w:rPr>
+          <w:b/>
+          <w:bCs/>
+        </w:rPr>
+        <w:t>7. Güvenlik Önlemleri</w:t>
       </w:r>
     </w:p>
     <w:p>
       <w:pPr>
         <w:numPr>
           <w:ilvl w:val="0"/>
-          <w:numId w:val="12"/>
+          <w:numId w:val="24"/>
         </w:numPr>
-      </w:pPr>
-      <w:r>
-        <w:t>Yetkilendirme mekanizması</w:t>
+        <w:rPr>
+          <w:b/>
+          <w:bCs/>
+        </w:rPr>
+      </w:pPr>
+      <w:r>
+        <w:rPr>
+          <w:b/>
+          <w:bCs/>
+        </w:rPr>
+        <w:t>Kimlik doğrulama sistemi</w:t>
       </w:r>
     </w:p>
     <w:p>
       <w:pPr>
         <w:numPr>
           <w:ilvl w:val="0"/>
-          <w:numId w:val="12"/>
+          <w:numId w:val="24"/>
         </w:numPr>
-      </w:pPr>
-      <w:r>
-        <w:t xml:space="preserve">SQL </w:t>
-      </w:r>
-      <w:proofErr w:type="spellStart"/>
-      <w:r>
-        <w:t>Injection</w:t>
-      </w:r>
-      <w:proofErr w:type="spellEnd"/>
-      <w:r>
-        <w:t xml:space="preserve"> koruması</w:t>
+        <w:rPr>
+          <w:b/>
+          <w:bCs/>
+        </w:rPr>
+      </w:pPr>
+      <w:r>
+        <w:rPr>
+          <w:b/>
+          <w:bCs/>
+        </w:rPr>
+        <w:t>Yetkilendirme kontrolleri</w:t>
       </w:r>
     </w:p>
     <w:p>
       <w:pPr>
         <w:numPr>
           <w:ilvl w:val="0"/>
-          <w:numId w:val="12"/>
+          <w:numId w:val="24"/>
         </w:numPr>
-      </w:pPr>
-      <w:r>
-        <w:t xml:space="preserve">Şifrelerin </w:t>
-      </w:r>
-      <w:proofErr w:type="spellStart"/>
-      <w:r>
-        <w:t>hashlenerek</w:t>
-      </w:r>
-      <w:proofErr w:type="spellEnd"/>
-      <w:r>
-        <w:t xml:space="preserve"> saklanması</w:t>
+        <w:rPr>
+          <w:b/>
+          <w:bCs/>
+        </w:rPr>
+      </w:pPr>
+      <w:r>
+        <w:rPr>
+          <w:b/>
+          <w:bCs/>
+        </w:rPr>
+        <w:t>SQL Injection koruması</w:t>
       </w:r>
     </w:p>
     <w:p>
       <w:pPr>
         <w:numPr>
           <w:ilvl w:val="0"/>
-          <w:numId w:val="12"/>
+          <w:numId w:val="24"/>
         </w:numPr>
-      </w:pPr>
-      <w:r>
-        <w:t>HTTPS desteği</w:t>
+        <w:rPr>
+          <w:b/>
+          <w:bCs/>
+        </w:rPr>
+      </w:pPr>
+      <w:r>
+        <w:rPr>
+          <w:b/>
+          <w:bCs/>
+        </w:rPr>
+        <w:t>Şifrelerin güvenli saklanması</w:t>
       </w:r>
     </w:p>
     <w:p>
       <w:pPr>
         <w:numPr>
           <w:ilvl w:val="0"/>
-          <w:numId w:val="12"/>
+          <w:numId w:val="24"/>
         </w:numPr>
-      </w:pPr>
-      <w:r>
-        <w:t>Güvenli API erişimi</w:t>
-      </w:r>
-    </w:p>
-    <w:p>
-      <w:r>
-        <w:pict w14:anchorId="61D993E4">
-          <v:rect id="_x0000_i1078" style="width:0;height:1.5pt" o:hralign="center" o:hrstd="t" o:hr="t" fillcolor="#a0a0a0" stroked="f"/>
-        </w:pict>
-      </w:r>
-    </w:p>
-    <w:p>
-      <w:pPr>
-        <w:rPr>
-          <w:b/>
-          <w:bCs/>
-        </w:rPr>
-      </w:pPr>
-      <w:r>
-        <w:rPr>
-          <w:b/>
-          <w:bCs/>
-        </w:rPr>
-        <w:t>7. Avantajları</w:t>
+        <w:rPr>
+          <w:b/>
+          <w:bCs/>
+        </w:rPr>
+      </w:pPr>
+      <w:r>
+        <w:rPr>
+          <w:b/>
+          <w:bCs/>
+        </w:rPr>
+        <w:t>Oturum yönetimi</w:t>
+      </w:r>
+    </w:p>
+    <w:p>
+      <w:pPr>
+        <w:rPr>
+          <w:b/>
+          <w:bCs/>
+        </w:rPr>
+      </w:pPr>
+      <w:r>
+        <w:rPr>
+          <w:b/>
+          <w:bCs/>
+        </w:rPr>
+        <w:t>8. Veritabanı Yapısı</w:t>
+      </w:r>
+    </w:p>
+    <w:p>
+      <w:pPr>
+        <w:rPr>
+          <w:b/>
+          <w:bCs/>
+        </w:rPr>
+      </w:pPr>
+      <w:r>
+        <w:rPr>
+          <w:b/>
+          <w:bCs/>
+        </w:rPr>
+        <w:t>Başlıca tablolar:</w:t>
       </w:r>
     </w:p>
     <w:p>
       <w:pPr>
         <w:numPr>
           <w:ilvl w:val="0"/>
-          <w:numId w:val="13"/>
+          <w:numId w:val="25"/>
         </w:numPr>
-      </w:pPr>
-      <w:r>
-        <w:t>Merkezi yönetim</w:t>
+        <w:rPr>
+          <w:b/>
+          <w:bCs/>
+        </w:rPr>
+      </w:pPr>
+      <w:r>
+        <w:rPr>
+          <w:b/>
+          <w:bCs/>
+        </w:rPr>
+        <w:t>Users</w:t>
       </w:r>
     </w:p>
     <w:p>
       <w:pPr>
         <w:numPr>
           <w:ilvl w:val="0"/>
-          <w:numId w:val="13"/>
+          <w:numId w:val="25"/>
         </w:numPr>
-      </w:pPr>
-      <w:r>
-        <w:t>Kullanıcı dostu arayüz</w:t>
+        <w:rPr>
+          <w:b/>
+          <w:bCs/>
+        </w:rPr>
+      </w:pPr>
+      <w:r>
+        <w:rPr>
+          <w:b/>
+          <w:bCs/>
+        </w:rPr>
+        <w:t>Devices</w:t>
       </w:r>
     </w:p>
     <w:p>
       <w:pPr>
         <w:numPr>
           <w:ilvl w:val="0"/>
-          <w:numId w:val="13"/>
+          <w:numId w:val="25"/>
         </w:numPr>
-      </w:pPr>
-      <w:r>
-        <w:t>Modüler yapı</w:t>
+        <w:rPr>
+          <w:b/>
+          <w:bCs/>
+        </w:rPr>
+      </w:pPr>
+      <w:r>
+        <w:rPr>
+          <w:b/>
+          <w:bCs/>
+        </w:rPr>
+        <w:t>DeviceStatus</w:t>
       </w:r>
     </w:p>
     <w:p>
       <w:pPr>
         <w:numPr>
           <w:ilvl w:val="0"/>
-          <w:numId w:val="13"/>
+          <w:numId w:val="25"/>
         </w:numPr>
-      </w:pPr>
-      <w:r>
-        <w:t>Kolay genişletilebilir mimari</w:t>
+        <w:rPr>
+          <w:b/>
+          <w:bCs/>
+        </w:rPr>
+      </w:pPr>
+      <w:r>
+        <w:rPr>
+          <w:b/>
+          <w:bCs/>
+        </w:rPr>
+        <w:t>Notifications</w:t>
       </w:r>
     </w:p>
     <w:p>
       <w:pPr>
         <w:numPr>
           <w:ilvl w:val="0"/>
-          <w:numId w:val="13"/>
+          <w:numId w:val="25"/>
         </w:numPr>
-      </w:pPr>
-      <w:r>
-        <w:t>Mobil ve web desteği</w:t>
+        <w:rPr>
+          <w:b/>
+          <w:bCs/>
+        </w:rPr>
+      </w:pPr>
+      <w:r>
+        <w:rPr>
+          <w:b/>
+          <w:bCs/>
+        </w:rPr>
+        <w:t>Messages</w:t>
       </w:r>
     </w:p>
     <w:p>
       <w:pPr>
         <w:numPr>
           <w:ilvl w:val="0"/>
-          <w:numId w:val="13"/>
+          <w:numId w:val="25"/>
         </w:numPr>
-      </w:pPr>
-      <w:r>
-        <w:t>Yerli geliştirme yaklaşımı</w:t>
-      </w:r>
-    </w:p>
-    <w:p>
-      <w:r>
-        <w:pict w14:anchorId="730B8211">
-          <v:rect id="_x0000_i1079" style="width:0;height:1.5pt" o:hralign="center" o:hrstd="t" o:hr="t" fillcolor="#a0a0a0" stroked="f"/>
-        </w:pict>
-      </w:r>
-    </w:p>
-    <w:p>
-      <w:pPr>
-        <w:rPr>
-          <w:b/>
-          <w:bCs/>
-        </w:rPr>
-      </w:pPr>
-      <w:r>
-        <w:rPr>
-          <w:b/>
-          <w:bCs/>
-        </w:rPr>
-        <w:lastRenderedPageBreak/>
-        <w:t>8. Gelecek Geliştirmeler</w:t>
+        <w:rPr>
+          <w:b/>
+          <w:bCs/>
+        </w:rPr>
+      </w:pPr>
+      <w:r>
+        <w:rPr>
+          <w:b/>
+          <w:bCs/>
+        </w:rPr>
+        <w:t>Roles</w:t>
       </w:r>
     </w:p>
     <w:p>
       <w:pPr>
         <w:numPr>
           <w:ilvl w:val="0"/>
-          <w:numId w:val="14"/>
+          <w:numId w:val="25"/>
         </w:numPr>
-      </w:pPr>
-      <w:r>
-        <w:t xml:space="preserve">Yapay </w:t>
-      </w:r>
-      <w:proofErr w:type="gramStart"/>
-      <w:r>
-        <w:t>zeka</w:t>
-      </w:r>
-      <w:proofErr w:type="gramEnd"/>
-      <w:r>
-        <w:t xml:space="preserve"> destekli asistan entegrasyonu</w:t>
+        <w:rPr>
+          <w:b/>
+          <w:bCs/>
+        </w:rPr>
+      </w:pPr>
+      <w:r>
+        <w:rPr>
+          <w:b/>
+          <w:bCs/>
+        </w:rPr>
+        <w:t>UserRoles</w:t>
+      </w:r>
+    </w:p>
+    <w:p>
+      <w:pPr>
+        <w:rPr>
+          <w:b/>
+          <w:bCs/>
+        </w:rPr>
+      </w:pPr>
+      <w:r>
+        <w:rPr>
+          <w:b/>
+          <w:bCs/>
+        </w:rPr>
+        <w:t>Bu yapı sistemin genişletilebilir olmasını sağlamaktadır.</w:t>
+      </w:r>
+    </w:p>
+    <w:p>
+      <w:pPr>
+        <w:rPr>
+          <w:b/>
+          <w:bCs/>
+        </w:rPr>
+      </w:pPr>
+      <w:r>
+        <w:rPr>
+          <w:b/>
+          <w:bCs/>
+        </w:rPr>
+        <w:t>9. Projenin Avantajları</w:t>
       </w:r>
     </w:p>
     <w:p>
       <w:pPr>
         <w:numPr>
           <w:ilvl w:val="0"/>
-          <w:numId w:val="14"/>
+          <w:numId w:val="26"/>
         </w:numPr>
-      </w:pPr>
-      <w:r>
-        <w:t>Sesli komut desteği</w:t>
+        <w:rPr>
+          <w:b/>
+          <w:bCs/>
+        </w:rPr>
+      </w:pPr>
+      <w:r>
+        <w:rPr>
+          <w:b/>
+          <w:bCs/>
+        </w:rPr>
+        <w:t>Merkezi cihaz yönetimi</w:t>
       </w:r>
     </w:p>
     <w:p>
       <w:pPr>
         <w:numPr>
           <w:ilvl w:val="0"/>
-          <w:numId w:val="14"/>
+          <w:numId w:val="26"/>
         </w:numPr>
-      </w:pPr>
-      <w:proofErr w:type="spellStart"/>
-      <w:r>
-        <w:t>IoT</w:t>
-      </w:r>
-      <w:proofErr w:type="spellEnd"/>
-      <w:r>
-        <w:t xml:space="preserve"> cihaz entegrasyonlarının artırılması</w:t>
+        <w:rPr>
+          <w:b/>
+          <w:bCs/>
+        </w:rPr>
+      </w:pPr>
+      <w:r>
+        <w:rPr>
+          <w:b/>
+          <w:bCs/>
+        </w:rPr>
+        <w:t>Kullanıcı dostu arayüz</w:t>
       </w:r>
     </w:p>
     <w:p>
       <w:pPr>
         <w:numPr>
           <w:ilvl w:val="0"/>
-          <w:numId w:val="14"/>
+          <w:numId w:val="26"/>
         </w:numPr>
-      </w:pPr>
-      <w:r>
-        <w:t>Gelişmiş otomasyon senaryoları</w:t>
+        <w:rPr>
+          <w:b/>
+          <w:bCs/>
+        </w:rPr>
+      </w:pPr>
+      <w:r>
+        <w:rPr>
+          <w:b/>
+          <w:bCs/>
+        </w:rPr>
+        <w:t>Modüler yapı</w:t>
       </w:r>
     </w:p>
     <w:p>
       <w:pPr>
         <w:numPr>
           <w:ilvl w:val="0"/>
-          <w:numId w:val="14"/>
+          <w:numId w:val="26"/>
         </w:numPr>
-      </w:pPr>
-      <w:r>
-        <w:t>Enerji tüketim analizleri</w:t>
+        <w:rPr>
+          <w:b/>
+          <w:bCs/>
+        </w:rPr>
+      </w:pPr>
+      <w:r>
+        <w:rPr>
+          <w:b/>
+          <w:bCs/>
+        </w:rPr>
+        <w:t>Ölçeklenebilir mimari</w:t>
       </w:r>
     </w:p>
     <w:p>
       <w:pPr>
         <w:numPr>
           <w:ilvl w:val="0"/>
-          <w:numId w:val="14"/>
+          <w:numId w:val="26"/>
         </w:numPr>
-      </w:pPr>
-      <w:r>
-        <w:t>Bulut senkronizasyonu</w:t>
+        <w:rPr>
+          <w:b/>
+          <w:bCs/>
+        </w:rPr>
+      </w:pPr>
+      <w:r>
+        <w:rPr>
+          <w:b/>
+          <w:bCs/>
+        </w:rPr>
+        <w:lastRenderedPageBreak/>
+        <w:t>Mobil uyumluluk</w:t>
       </w:r>
     </w:p>
     <w:p>
       <w:pPr>
         <w:numPr>
           <w:ilvl w:val="0"/>
-          <w:numId w:val="14"/>
+          <w:numId w:val="26"/>
         </w:numPr>
-      </w:pPr>
-      <w:r>
-        <w:t>Çoklu kullanıcı desteği</w:t>
-      </w:r>
-    </w:p>
-    <w:p>
-      <w:r>
-        <w:pict w14:anchorId="1B89CA21">
-          <v:rect id="_x0000_i1080" style="width:0;height:1.5pt" o:hralign="center" o:hrstd="t" o:hr="t" fillcolor="#a0a0a0" stroked="f"/>
-        </w:pict>
-      </w:r>
-    </w:p>
-    <w:p>
-      <w:pPr>
-        <w:rPr>
-          <w:b/>
-          <w:bCs/>
-        </w:rPr>
-      </w:pPr>
-      <w:r>
-        <w:rPr>
-          <w:b/>
-          <w:bCs/>
-        </w:rPr>
-        <w:t>9. Sonuç</w:t>
-      </w:r>
-    </w:p>
-    <w:p>
-      <w:r>
-        <w:t xml:space="preserve">Home Asistan projesi, akıllı ev teknolojilerini merkezi bir platform üzerinden yönetmeyi amaçlayan modern bir otomasyon sistemidir. ASP.NET </w:t>
-      </w:r>
-      <w:proofErr w:type="spellStart"/>
-      <w:r>
-        <w:t>Core</w:t>
-      </w:r>
-      <w:proofErr w:type="spellEnd"/>
-      <w:r>
-        <w:t xml:space="preserve"> ve SQL Server altyapısı sayesinde güvenilir ve ölçeklenebilir bir mimari sunarken, web ve mobil istemciler ile kullanıcıların cihazlarını her yerden kontrol etmesine olanak sağlamaktadır. Gelecekte eklenecek yapay </w:t>
-      </w:r>
-      <w:proofErr w:type="gramStart"/>
-      <w:r>
-        <w:t>zeka</w:t>
-      </w:r>
-      <w:proofErr w:type="gramEnd"/>
-      <w:r>
-        <w:t xml:space="preserve"> ve gelişmiş otomasyon özellikleri ile kapsamlı bir akıllı ev çözümüne dönüşmesi hedeflenmektedir.</w:t>
+        <w:rPr>
+          <w:b/>
+          <w:bCs/>
+        </w:rPr>
+      </w:pPr>
+      <w:r>
+        <w:rPr>
+          <w:b/>
+          <w:bCs/>
+        </w:rPr>
+        <w:t>Güvenli veri yönetimi</w:t>
+      </w:r>
+    </w:p>
+    <w:p>
+      <w:pPr>
+        <w:rPr>
+          <w:b/>
+          <w:bCs/>
+        </w:rPr>
+      </w:pPr>
+      <w:r>
+        <w:rPr>
+          <w:b/>
+          <w:bCs/>
+        </w:rPr>
+        <w:t>10. Gelecek Geliştirmeler</w:t>
+      </w:r>
+    </w:p>
+    <w:p>
+      <w:pPr>
+        <w:numPr>
+          <w:ilvl w:val="0"/>
+          <w:numId w:val="27"/>
+        </w:numPr>
+        <w:rPr>
+          <w:b/>
+          <w:bCs/>
+        </w:rPr>
+      </w:pPr>
+      <w:r>
+        <w:rPr>
+          <w:b/>
+          <w:bCs/>
+        </w:rPr>
+        <w:t>Sesli komut desteği</w:t>
+      </w:r>
+    </w:p>
+    <w:p>
+      <w:pPr>
+        <w:numPr>
+          <w:ilvl w:val="0"/>
+          <w:numId w:val="27"/>
+        </w:numPr>
+        <w:rPr>
+          <w:b/>
+          <w:bCs/>
+        </w:rPr>
+      </w:pPr>
+      <w:r>
+        <w:rPr>
+          <w:b/>
+          <w:bCs/>
+        </w:rPr>
+        <w:t>Yapay zeka destekli otomasyonlar</w:t>
+      </w:r>
+    </w:p>
+    <w:p>
+      <w:pPr>
+        <w:numPr>
+          <w:ilvl w:val="0"/>
+          <w:numId w:val="27"/>
+        </w:numPr>
+        <w:rPr>
+          <w:b/>
+          <w:bCs/>
+        </w:rPr>
+      </w:pPr>
+      <w:r>
+        <w:rPr>
+          <w:b/>
+          <w:bCs/>
+        </w:rPr>
+        <w:t>Mobil uygulama geliştirmesi</w:t>
+      </w:r>
+    </w:p>
+    <w:p>
+      <w:pPr>
+        <w:numPr>
+          <w:ilvl w:val="0"/>
+          <w:numId w:val="27"/>
+        </w:numPr>
+        <w:rPr>
+          <w:b/>
+          <w:bCs/>
+        </w:rPr>
+      </w:pPr>
+      <w:r>
+        <w:rPr>
+          <w:b/>
+          <w:bCs/>
+        </w:rPr>
+        <w:t>Gerçek zamanlı veri akışı</w:t>
+      </w:r>
+    </w:p>
+    <w:p>
+      <w:pPr>
+        <w:numPr>
+          <w:ilvl w:val="0"/>
+          <w:numId w:val="27"/>
+        </w:numPr>
+        <w:rPr>
+          <w:b/>
+          <w:bCs/>
+        </w:rPr>
+      </w:pPr>
+      <w:r>
+        <w:rPr>
+          <w:b/>
+          <w:bCs/>
+        </w:rPr>
+        <w:t>Akıllı senaryo sistemi</w:t>
+      </w:r>
+    </w:p>
+    <w:p>
+      <w:pPr>
+        <w:numPr>
+          <w:ilvl w:val="0"/>
+          <w:numId w:val="27"/>
+        </w:numPr>
+        <w:rPr>
+          <w:b/>
+          <w:bCs/>
+        </w:rPr>
+      </w:pPr>
+      <w:r>
+        <w:rPr>
+          <w:b/>
+          <w:bCs/>
+        </w:rPr>
+        <w:t>Çoklu cihaz entegrasyonu</w:t>
+      </w:r>
+    </w:p>
+    <w:p>
+      <w:pPr>
+        <w:rPr>
+          <w:b/>
+          <w:bCs/>
+        </w:rPr>
+      </w:pPr>
+      <w:r>
+        <w:rPr>
+          <w:b/>
+          <w:bCs/>
+        </w:rPr>
+        <w:t>11. Sonuç</w:t>
+      </w:r>
+    </w:p>
+    <w:p>
+      <w:pPr>
+        <w:rPr>
+          <w:b/>
+          <w:bCs/>
+        </w:rPr>
+      </w:pPr>
+      <w:r>
+        <w:rPr>
+          <w:b/>
+          <w:bCs/>
+        </w:rPr>
+        <w:t>Home Asistan projesi, modern akıllı ev sistemlerinin yönetimini kolaylaştırmayı hedefleyen bir otomasyon platformudur. ASP.NET, C# ve SQL Server teknolojileri kullanılarak geliştirilen sistem; güvenli, ölçeklenebilir ve kullanıcı dostu bir altyapı sunmaktadır. Projenin ilerleyen sürümlerinde yapay zeka destekli özellikler ve gelişmiş otomasyon senaryoları ile daha kapsamlı bir akıllı ev deneyimi sağlanması planlanmaktadır.</w:t>
       </w:r>
     </w:p>
     <w:p/>
@@ -1417,6 +1944,155 @@
     </w:lvl>
   </w:abstractNum>
   <w:abstractNum w:abstractNumId="2" w15:restartNumberingAfterBreak="0">
+    <w:nsid w:val="0B8D5B4B"/>
+    <w:multiLevelType w:val="multilevel"/>
+    <w:tmpl w:val="2794B568"/>
+    <w:lvl w:ilvl="0">
+      <w:start w:val="1"/>
+      <w:numFmt w:val="bullet"/>
+      <w:lvlText w:val=""/>
+      <w:lvlJc w:val="left"/>
+      <w:pPr>
+        <w:tabs>
+          <w:tab w:val="num" w:pos="720"/>
+        </w:tabs>
+        <w:ind w:left="720" w:hanging="360"/>
+      </w:pPr>
+      <w:rPr>
+        <w:rFonts w:ascii="Symbol" w:hAnsi="Symbol" w:hint="default"/>
+        <w:sz w:val="20"/>
+      </w:rPr>
+    </w:lvl>
+    <w:lvl w:ilvl="1" w:tentative="1">
+      <w:start w:val="1"/>
+      <w:numFmt w:val="bullet"/>
+      <w:lvlText w:val="o"/>
+      <w:lvlJc w:val="left"/>
+      <w:pPr>
+        <w:tabs>
+          <w:tab w:val="num" w:pos="1440"/>
+        </w:tabs>
+        <w:ind w:left="1440" w:hanging="360"/>
+      </w:pPr>
+      <w:rPr>
+        <w:rFonts w:ascii="Courier New" w:hAnsi="Courier New" w:hint="default"/>
+        <w:sz w:val="20"/>
+      </w:rPr>
+    </w:lvl>
+    <w:lvl w:ilvl="2" w:tentative="1">
+      <w:start w:val="1"/>
+      <w:numFmt w:val="bullet"/>
+      <w:lvlText w:val=""/>
+      <w:lvlJc w:val="left"/>
+      <w:pPr>
+        <w:tabs>
+          <w:tab w:val="num" w:pos="2160"/>
+        </w:tabs>
+        <w:ind w:left="2160" w:hanging="360"/>
+      </w:pPr>
+      <w:rPr>
+        <w:rFonts w:ascii="Wingdings" w:hAnsi="Wingdings" w:hint="default"/>
+        <w:sz w:val="20"/>
+      </w:rPr>
+    </w:lvl>
+    <w:lvl w:ilvl="3" w:tentative="1">
+      <w:start w:val="1"/>
+      <w:numFmt w:val="bullet"/>
+      <w:lvlText w:val=""/>
+      <w:lvlJc w:val="left"/>
+      <w:pPr>
+        <w:tabs>
+          <w:tab w:val="num" w:pos="2880"/>
+        </w:tabs>
+        <w:ind w:left="2880" w:hanging="360"/>
+      </w:pPr>
+      <w:rPr>
+        <w:rFonts w:ascii="Wingdings" w:hAnsi="Wingdings" w:hint="default"/>
+        <w:sz w:val="20"/>
+      </w:rPr>
+    </w:lvl>
+    <w:lvl w:ilvl="4" w:tentative="1">
+      <w:start w:val="1"/>
+      <w:numFmt w:val="bullet"/>
+      <w:lvlText w:val=""/>
+      <w:lvlJc w:val="left"/>
+      <w:pPr>
+        <w:tabs>
+          <w:tab w:val="num" w:pos="3600"/>
+        </w:tabs>
+        <w:ind w:left="3600" w:hanging="360"/>
+      </w:pPr>
+      <w:rPr>
+        <w:rFonts w:ascii="Wingdings" w:hAnsi="Wingdings" w:hint="default"/>
+        <w:sz w:val="20"/>
+      </w:rPr>
+    </w:lvl>
+    <w:lvl w:ilvl="5" w:tentative="1">
+      <w:start w:val="1"/>
+      <w:numFmt w:val="bullet"/>
+      <w:lvlText w:val=""/>
+      <w:lvlJc w:val="left"/>
+      <w:pPr>
+        <w:tabs>
+          <w:tab w:val="num" w:pos="4320"/>
+        </w:tabs>
+        <w:ind w:left="4320" w:hanging="360"/>
+      </w:pPr>
+      <w:rPr>
+        <w:rFonts w:ascii="Wingdings" w:hAnsi="Wingdings" w:hint="default"/>
+        <w:sz w:val="20"/>
+      </w:rPr>
+    </w:lvl>
+    <w:lvl w:ilvl="6" w:tentative="1">
+      <w:start w:val="1"/>
+      <w:numFmt w:val="bullet"/>
+      <w:lvlText w:val=""/>
+      <w:lvlJc w:val="left"/>
+      <w:pPr>
+        <w:tabs>
+          <w:tab w:val="num" w:pos="5040"/>
+        </w:tabs>
+        <w:ind w:left="5040" w:hanging="360"/>
+      </w:pPr>
+      <w:rPr>
+        <w:rFonts w:ascii="Wingdings" w:hAnsi="Wingdings" w:hint="default"/>
+        <w:sz w:val="20"/>
+      </w:rPr>
+    </w:lvl>
+    <w:lvl w:ilvl="7" w:tentative="1">
+      <w:start w:val="1"/>
+      <w:numFmt w:val="bullet"/>
+      <w:lvlText w:val=""/>
+      <w:lvlJc w:val="left"/>
+      <w:pPr>
+        <w:tabs>
+          <w:tab w:val="num" w:pos="5760"/>
+        </w:tabs>
+        <w:ind w:left="5760" w:hanging="360"/>
+      </w:pPr>
+      <w:rPr>
+        <w:rFonts w:ascii="Wingdings" w:hAnsi="Wingdings" w:hint="default"/>
+        <w:sz w:val="20"/>
+      </w:rPr>
+    </w:lvl>
+    <w:lvl w:ilvl="8" w:tentative="1">
+      <w:start w:val="1"/>
+      <w:numFmt w:val="bullet"/>
+      <w:lvlText w:val=""/>
+      <w:lvlJc w:val="left"/>
+      <w:pPr>
+        <w:tabs>
+          <w:tab w:val="num" w:pos="6480"/>
+        </w:tabs>
+        <w:ind w:left="6480" w:hanging="360"/>
+      </w:pPr>
+      <w:rPr>
+        <w:rFonts w:ascii="Wingdings" w:hAnsi="Wingdings" w:hint="default"/>
+        <w:sz w:val="20"/>
+      </w:rPr>
+    </w:lvl>
+  </w:abstractNum>
+  <w:abstractNum w:abstractNumId="3" w15:restartNumberingAfterBreak="0">
     <w:nsid w:val="0C7E7298"/>
     <w:multiLevelType w:val="multilevel"/>
     <w:tmpl w:val="E98EA134"/>
@@ -1565,7 +2241,7 @@
       </w:rPr>
     </w:lvl>
   </w:abstractNum>
-  <w:abstractNum w:abstractNumId="3" w15:restartNumberingAfterBreak="0">
+  <w:abstractNum w:abstractNumId="4" w15:restartNumberingAfterBreak="0">
     <w:nsid w:val="11AA6319"/>
     <w:multiLevelType w:val="multilevel"/>
     <w:tmpl w:val="25047948"/>
@@ -1714,7 +2390,156 @@
       </w:rPr>
     </w:lvl>
   </w:abstractNum>
-  <w:abstractNum w:abstractNumId="4" w15:restartNumberingAfterBreak="0">
+  <w:abstractNum w:abstractNumId="5" w15:restartNumberingAfterBreak="0">
+    <w:nsid w:val="15B742A2"/>
+    <w:multiLevelType w:val="multilevel"/>
+    <w:tmpl w:val="1396B9EA"/>
+    <w:lvl w:ilvl="0">
+      <w:start w:val="1"/>
+      <w:numFmt w:val="bullet"/>
+      <w:lvlText w:val=""/>
+      <w:lvlJc w:val="left"/>
+      <w:pPr>
+        <w:tabs>
+          <w:tab w:val="num" w:pos="720"/>
+        </w:tabs>
+        <w:ind w:left="720" w:hanging="360"/>
+      </w:pPr>
+      <w:rPr>
+        <w:rFonts w:ascii="Symbol" w:hAnsi="Symbol" w:hint="default"/>
+        <w:sz w:val="20"/>
+      </w:rPr>
+    </w:lvl>
+    <w:lvl w:ilvl="1" w:tentative="1">
+      <w:start w:val="1"/>
+      <w:numFmt w:val="bullet"/>
+      <w:lvlText w:val="o"/>
+      <w:lvlJc w:val="left"/>
+      <w:pPr>
+        <w:tabs>
+          <w:tab w:val="num" w:pos="1440"/>
+        </w:tabs>
+        <w:ind w:left="1440" w:hanging="360"/>
+      </w:pPr>
+      <w:rPr>
+        <w:rFonts w:ascii="Courier New" w:hAnsi="Courier New" w:hint="default"/>
+        <w:sz w:val="20"/>
+      </w:rPr>
+    </w:lvl>
+    <w:lvl w:ilvl="2" w:tentative="1">
+      <w:start w:val="1"/>
+      <w:numFmt w:val="bullet"/>
+      <w:lvlText w:val=""/>
+      <w:lvlJc w:val="left"/>
+      <w:pPr>
+        <w:tabs>
+          <w:tab w:val="num" w:pos="2160"/>
+        </w:tabs>
+        <w:ind w:left="2160" w:hanging="360"/>
+      </w:pPr>
+      <w:rPr>
+        <w:rFonts w:ascii="Wingdings" w:hAnsi="Wingdings" w:hint="default"/>
+        <w:sz w:val="20"/>
+      </w:rPr>
+    </w:lvl>
+    <w:lvl w:ilvl="3" w:tentative="1">
+      <w:start w:val="1"/>
+      <w:numFmt w:val="bullet"/>
+      <w:lvlText w:val=""/>
+      <w:lvlJc w:val="left"/>
+      <w:pPr>
+        <w:tabs>
+          <w:tab w:val="num" w:pos="2880"/>
+        </w:tabs>
+        <w:ind w:left="2880" w:hanging="360"/>
+      </w:pPr>
+      <w:rPr>
+        <w:rFonts w:ascii="Wingdings" w:hAnsi="Wingdings" w:hint="default"/>
+        <w:sz w:val="20"/>
+      </w:rPr>
+    </w:lvl>
+    <w:lvl w:ilvl="4" w:tentative="1">
+      <w:start w:val="1"/>
+      <w:numFmt w:val="bullet"/>
+      <w:lvlText w:val=""/>
+      <w:lvlJc w:val="left"/>
+      <w:pPr>
+        <w:tabs>
+          <w:tab w:val="num" w:pos="3600"/>
+        </w:tabs>
+        <w:ind w:left="3600" w:hanging="360"/>
+      </w:pPr>
+      <w:rPr>
+        <w:rFonts w:ascii="Wingdings" w:hAnsi="Wingdings" w:hint="default"/>
+        <w:sz w:val="20"/>
+      </w:rPr>
+    </w:lvl>
+    <w:lvl w:ilvl="5" w:tentative="1">
+      <w:start w:val="1"/>
+      <w:numFmt w:val="bullet"/>
+      <w:lvlText w:val=""/>
+      <w:lvlJc w:val="left"/>
+      <w:pPr>
+        <w:tabs>
+          <w:tab w:val="num" w:pos="4320"/>
+        </w:tabs>
+        <w:ind w:left="4320" w:hanging="360"/>
+      </w:pPr>
+      <w:rPr>
+        <w:rFonts w:ascii="Wingdings" w:hAnsi="Wingdings" w:hint="default"/>
+        <w:sz w:val="20"/>
+      </w:rPr>
+    </w:lvl>
+    <w:lvl w:ilvl="6" w:tentative="1">
+      <w:start w:val="1"/>
+      <w:numFmt w:val="bullet"/>
+      <w:lvlText w:val=""/>
+      <w:lvlJc w:val="left"/>
+      <w:pPr>
+        <w:tabs>
+          <w:tab w:val="num" w:pos="5040"/>
+        </w:tabs>
+        <w:ind w:left="5040" w:hanging="360"/>
+      </w:pPr>
+      <w:rPr>
+        <w:rFonts w:ascii="Wingdings" w:hAnsi="Wingdings" w:hint="default"/>
+        <w:sz w:val="20"/>
+      </w:rPr>
+    </w:lvl>
+    <w:lvl w:ilvl="7" w:tentative="1">
+      <w:start w:val="1"/>
+      <w:numFmt w:val="bullet"/>
+      <w:lvlText w:val=""/>
+      <w:lvlJc w:val="left"/>
+      <w:pPr>
+        <w:tabs>
+          <w:tab w:val="num" w:pos="5760"/>
+        </w:tabs>
+        <w:ind w:left="5760" w:hanging="360"/>
+      </w:pPr>
+      <w:rPr>
+        <w:rFonts w:ascii="Wingdings" w:hAnsi="Wingdings" w:hint="default"/>
+        <w:sz w:val="20"/>
+      </w:rPr>
+    </w:lvl>
+    <w:lvl w:ilvl="8" w:tentative="1">
+      <w:start w:val="1"/>
+      <w:numFmt w:val="bullet"/>
+      <w:lvlText w:val=""/>
+      <w:lvlJc w:val="left"/>
+      <w:pPr>
+        <w:tabs>
+          <w:tab w:val="num" w:pos="6480"/>
+        </w:tabs>
+        <w:ind w:left="6480" w:hanging="360"/>
+      </w:pPr>
+      <w:rPr>
+        <w:rFonts w:ascii="Wingdings" w:hAnsi="Wingdings" w:hint="default"/>
+        <w:sz w:val="20"/>
+      </w:rPr>
+    </w:lvl>
+  </w:abstractNum>
+  <w:abstractNum w:abstractNumId="6" w15:restartNumberingAfterBreak="0">
     <w:nsid w:val="17F1378A"/>
     <w:multiLevelType w:val="multilevel"/>
     <w:tmpl w:val="B18E233E"/>
@@ -1863,7 +2688,7 @@
       </w:rPr>
     </w:lvl>
   </w:abstractNum>
-  <w:abstractNum w:abstractNumId="5" w15:restartNumberingAfterBreak="0">
+  <w:abstractNum w:abstractNumId="7" w15:restartNumberingAfterBreak="0">
     <w:nsid w:val="19B26672"/>
     <w:multiLevelType w:val="multilevel"/>
     <w:tmpl w:val="BC96810A"/>
@@ -2012,7 +2837,305 @@
       </w:rPr>
     </w:lvl>
   </w:abstractNum>
-  <w:abstractNum w:abstractNumId="6" w15:restartNumberingAfterBreak="0">
+  <w:abstractNum w:abstractNumId="8" w15:restartNumberingAfterBreak="0">
+    <w:nsid w:val="1F6C3548"/>
+    <w:multiLevelType w:val="multilevel"/>
+    <w:tmpl w:val="922C3456"/>
+    <w:lvl w:ilvl="0">
+      <w:start w:val="1"/>
+      <w:numFmt w:val="bullet"/>
+      <w:lvlText w:val=""/>
+      <w:lvlJc w:val="left"/>
+      <w:pPr>
+        <w:tabs>
+          <w:tab w:val="num" w:pos="720"/>
+        </w:tabs>
+        <w:ind w:left="720" w:hanging="360"/>
+      </w:pPr>
+      <w:rPr>
+        <w:rFonts w:ascii="Symbol" w:hAnsi="Symbol" w:hint="default"/>
+        <w:sz w:val="20"/>
+      </w:rPr>
+    </w:lvl>
+    <w:lvl w:ilvl="1" w:tentative="1">
+      <w:start w:val="1"/>
+      <w:numFmt w:val="bullet"/>
+      <w:lvlText w:val="o"/>
+      <w:lvlJc w:val="left"/>
+      <w:pPr>
+        <w:tabs>
+          <w:tab w:val="num" w:pos="1440"/>
+        </w:tabs>
+        <w:ind w:left="1440" w:hanging="360"/>
+      </w:pPr>
+      <w:rPr>
+        <w:rFonts w:ascii="Courier New" w:hAnsi="Courier New" w:hint="default"/>
+        <w:sz w:val="20"/>
+      </w:rPr>
+    </w:lvl>
+    <w:lvl w:ilvl="2" w:tentative="1">
+      <w:start w:val="1"/>
+      <w:numFmt w:val="bullet"/>
+      <w:lvlText w:val=""/>
+      <w:lvlJc w:val="left"/>
+      <w:pPr>
+        <w:tabs>
+          <w:tab w:val="num" w:pos="2160"/>
+        </w:tabs>
+        <w:ind w:left="2160" w:hanging="360"/>
+      </w:pPr>
+      <w:rPr>
+        <w:rFonts w:ascii="Wingdings" w:hAnsi="Wingdings" w:hint="default"/>
+        <w:sz w:val="20"/>
+      </w:rPr>
+    </w:lvl>
+    <w:lvl w:ilvl="3" w:tentative="1">
+      <w:start w:val="1"/>
+      <w:numFmt w:val="bullet"/>
+      <w:lvlText w:val=""/>
+      <w:lvlJc w:val="left"/>
+      <w:pPr>
+        <w:tabs>
+          <w:tab w:val="num" w:pos="2880"/>
+        </w:tabs>
+        <w:ind w:left="2880" w:hanging="360"/>
+      </w:pPr>
+      <w:rPr>
+        <w:rFonts w:ascii="Wingdings" w:hAnsi="Wingdings" w:hint="default"/>
+        <w:sz w:val="20"/>
+      </w:rPr>
+    </w:lvl>
+    <w:lvl w:ilvl="4" w:tentative="1">
+      <w:start w:val="1"/>
+      <w:numFmt w:val="bullet"/>
+      <w:lvlText w:val=""/>
+      <w:lvlJc w:val="left"/>
+      <w:pPr>
+        <w:tabs>
+          <w:tab w:val="num" w:pos="3600"/>
+        </w:tabs>
+        <w:ind w:left="3600" w:hanging="360"/>
+      </w:pPr>
+      <w:rPr>
+        <w:rFonts w:ascii="Wingdings" w:hAnsi="Wingdings" w:hint="default"/>
+        <w:sz w:val="20"/>
+      </w:rPr>
+    </w:lvl>
+    <w:lvl w:ilvl="5" w:tentative="1">
+      <w:start w:val="1"/>
+      <w:numFmt w:val="bullet"/>
+      <w:lvlText w:val=""/>
+      <w:lvlJc w:val="left"/>
+      <w:pPr>
+        <w:tabs>
+          <w:tab w:val="num" w:pos="4320"/>
+        </w:tabs>
+        <w:ind w:left="4320" w:hanging="360"/>
+      </w:pPr>
+      <w:rPr>
+        <w:rFonts w:ascii="Wingdings" w:hAnsi="Wingdings" w:hint="default"/>
+        <w:sz w:val="20"/>
+      </w:rPr>
+    </w:lvl>
+    <w:lvl w:ilvl="6" w:tentative="1">
+      <w:start w:val="1"/>
+      <w:numFmt w:val="bullet"/>
+      <w:lvlText w:val=""/>
+      <w:lvlJc w:val="left"/>
+      <w:pPr>
+        <w:tabs>
+          <w:tab w:val="num" w:pos="5040"/>
+        </w:tabs>
+        <w:ind w:left="5040" w:hanging="360"/>
+      </w:pPr>
+      <w:rPr>
+        <w:rFonts w:ascii="Wingdings" w:hAnsi="Wingdings" w:hint="default"/>
+        <w:sz w:val="20"/>
+      </w:rPr>
+    </w:lvl>
+    <w:lvl w:ilvl="7" w:tentative="1">
+      <w:start w:val="1"/>
+      <w:numFmt w:val="bullet"/>
+      <w:lvlText w:val=""/>
+      <w:lvlJc w:val="left"/>
+      <w:pPr>
+        <w:tabs>
+          <w:tab w:val="num" w:pos="5760"/>
+        </w:tabs>
+        <w:ind w:left="5760" w:hanging="360"/>
+      </w:pPr>
+      <w:rPr>
+        <w:rFonts w:ascii="Wingdings" w:hAnsi="Wingdings" w:hint="default"/>
+        <w:sz w:val="20"/>
+      </w:rPr>
+    </w:lvl>
+    <w:lvl w:ilvl="8" w:tentative="1">
+      <w:start w:val="1"/>
+      <w:numFmt w:val="bullet"/>
+      <w:lvlText w:val=""/>
+      <w:lvlJc w:val="left"/>
+      <w:pPr>
+        <w:tabs>
+          <w:tab w:val="num" w:pos="6480"/>
+        </w:tabs>
+        <w:ind w:left="6480" w:hanging="360"/>
+      </w:pPr>
+      <w:rPr>
+        <w:rFonts w:ascii="Wingdings" w:hAnsi="Wingdings" w:hint="default"/>
+        <w:sz w:val="20"/>
+      </w:rPr>
+    </w:lvl>
+  </w:abstractNum>
+  <w:abstractNum w:abstractNumId="9" w15:restartNumberingAfterBreak="0">
+    <w:nsid w:val="200B0E1D"/>
+    <w:multiLevelType w:val="multilevel"/>
+    <w:tmpl w:val="4B1E2780"/>
+    <w:lvl w:ilvl="0">
+      <w:start w:val="1"/>
+      <w:numFmt w:val="bullet"/>
+      <w:lvlText w:val=""/>
+      <w:lvlJc w:val="left"/>
+      <w:pPr>
+        <w:tabs>
+          <w:tab w:val="num" w:pos="720"/>
+        </w:tabs>
+        <w:ind w:left="720" w:hanging="360"/>
+      </w:pPr>
+      <w:rPr>
+        <w:rFonts w:ascii="Symbol" w:hAnsi="Symbol" w:hint="default"/>
+        <w:sz w:val="20"/>
+      </w:rPr>
+    </w:lvl>
+    <w:lvl w:ilvl="1" w:tentative="1">
+      <w:start w:val="1"/>
+      <w:numFmt w:val="bullet"/>
+      <w:lvlText w:val="o"/>
+      <w:lvlJc w:val="left"/>
+      <w:pPr>
+        <w:tabs>
+          <w:tab w:val="num" w:pos="1440"/>
+        </w:tabs>
+        <w:ind w:left="1440" w:hanging="360"/>
+      </w:pPr>
+      <w:rPr>
+        <w:rFonts w:ascii="Courier New" w:hAnsi="Courier New" w:hint="default"/>
+        <w:sz w:val="20"/>
+      </w:rPr>
+    </w:lvl>
+    <w:lvl w:ilvl="2" w:tentative="1">
+      <w:start w:val="1"/>
+      <w:numFmt w:val="bullet"/>
+      <w:lvlText w:val=""/>
+      <w:lvlJc w:val="left"/>
+      <w:pPr>
+        <w:tabs>
+          <w:tab w:val="num" w:pos="2160"/>
+        </w:tabs>
+        <w:ind w:left="2160" w:hanging="360"/>
+      </w:pPr>
+      <w:rPr>
+        <w:rFonts w:ascii="Wingdings" w:hAnsi="Wingdings" w:hint="default"/>
+        <w:sz w:val="20"/>
+      </w:rPr>
+    </w:lvl>
+    <w:lvl w:ilvl="3" w:tentative="1">
+      <w:start w:val="1"/>
+      <w:numFmt w:val="bullet"/>
+      <w:lvlText w:val=""/>
+      <w:lvlJc w:val="left"/>
+      <w:pPr>
+        <w:tabs>
+          <w:tab w:val="num" w:pos="2880"/>
+        </w:tabs>
+        <w:ind w:left="2880" w:hanging="360"/>
+      </w:pPr>
+      <w:rPr>
+        <w:rFonts w:ascii="Wingdings" w:hAnsi="Wingdings" w:hint="default"/>
+        <w:sz w:val="20"/>
+      </w:rPr>
+    </w:lvl>
+    <w:lvl w:ilvl="4" w:tentative="1">
+      <w:start w:val="1"/>
+      <w:numFmt w:val="bullet"/>
+      <w:lvlText w:val=""/>
+      <w:lvlJc w:val="left"/>
+      <w:pPr>
+        <w:tabs>
+          <w:tab w:val="num" w:pos="3600"/>
+        </w:tabs>
+        <w:ind w:left="3600" w:hanging="360"/>
+      </w:pPr>
+      <w:rPr>
+        <w:rFonts w:ascii="Wingdings" w:hAnsi="Wingdings" w:hint="default"/>
+        <w:sz w:val="20"/>
+      </w:rPr>
+    </w:lvl>
+    <w:lvl w:ilvl="5" w:tentative="1">
+      <w:start w:val="1"/>
+      <w:numFmt w:val="bullet"/>
+      <w:lvlText w:val=""/>
+      <w:lvlJc w:val="left"/>
+      <w:pPr>
+        <w:tabs>
+          <w:tab w:val="num" w:pos="4320"/>
+        </w:tabs>
+        <w:ind w:left="4320" w:hanging="360"/>
+      </w:pPr>
+      <w:rPr>
+        <w:rFonts w:ascii="Wingdings" w:hAnsi="Wingdings" w:hint="default"/>
+        <w:sz w:val="20"/>
+      </w:rPr>
+    </w:lvl>
+    <w:lvl w:ilvl="6" w:tentative="1">
+      <w:start w:val="1"/>
+      <w:numFmt w:val="bullet"/>
+      <w:lvlText w:val=""/>
+      <w:lvlJc w:val="left"/>
+      <w:pPr>
+        <w:tabs>
+          <w:tab w:val="num" w:pos="5040"/>
+        </w:tabs>
+        <w:ind w:left="5040" w:hanging="360"/>
+      </w:pPr>
+      <w:rPr>
+        <w:rFonts w:ascii="Wingdings" w:hAnsi="Wingdings" w:hint="default"/>
+        <w:sz w:val="20"/>
+      </w:rPr>
+    </w:lvl>
+    <w:lvl w:ilvl="7" w:tentative="1">
+      <w:start w:val="1"/>
+      <w:numFmt w:val="bullet"/>
+      <w:lvlText w:val=""/>
+      <w:lvlJc w:val="left"/>
+      <w:pPr>
+        <w:tabs>
+          <w:tab w:val="num" w:pos="5760"/>
+        </w:tabs>
+        <w:ind w:left="5760" w:hanging="360"/>
+      </w:pPr>
+      <w:rPr>
+        <w:rFonts w:ascii="Wingdings" w:hAnsi="Wingdings" w:hint="default"/>
+        <w:sz w:val="20"/>
+      </w:rPr>
+    </w:lvl>
+    <w:lvl w:ilvl="8" w:tentative="1">
+      <w:start w:val="1"/>
+      <w:numFmt w:val="bullet"/>
+      <w:lvlText w:val=""/>
+      <w:lvlJc w:val="left"/>
+      <w:pPr>
+        <w:tabs>
+          <w:tab w:val="num" w:pos="6480"/>
+        </w:tabs>
+        <w:ind w:left="6480" w:hanging="360"/>
+      </w:pPr>
+      <w:rPr>
+        <w:rFonts w:ascii="Wingdings" w:hAnsi="Wingdings" w:hint="default"/>
+        <w:sz w:val="20"/>
+      </w:rPr>
+    </w:lvl>
+  </w:abstractNum>
+  <w:abstractNum w:abstractNumId="10" w15:restartNumberingAfterBreak="0">
     <w:nsid w:val="20A3360C"/>
     <w:multiLevelType w:val="multilevel"/>
     <w:tmpl w:val="3AC05880"/>
@@ -2161,7 +3284,7 @@
       </w:rPr>
     </w:lvl>
   </w:abstractNum>
-  <w:abstractNum w:abstractNumId="7" w15:restartNumberingAfterBreak="0">
+  <w:abstractNum w:abstractNumId="11" w15:restartNumberingAfterBreak="0">
     <w:nsid w:val="20AD3735"/>
     <w:multiLevelType w:val="multilevel"/>
     <w:tmpl w:val="75745C44"/>
@@ -2310,7 +3433,7 @@
       </w:rPr>
     </w:lvl>
   </w:abstractNum>
-  <w:abstractNum w:abstractNumId="8" w15:restartNumberingAfterBreak="0">
+  <w:abstractNum w:abstractNumId="12" w15:restartNumberingAfterBreak="0">
     <w:nsid w:val="33475861"/>
     <w:multiLevelType w:val="multilevel"/>
     <w:tmpl w:val="9CBA2280"/>
@@ -2459,7 +3582,752 @@
       </w:rPr>
     </w:lvl>
   </w:abstractNum>
-  <w:abstractNum w:abstractNumId="9" w15:restartNumberingAfterBreak="0">
+  <w:abstractNum w:abstractNumId="13" w15:restartNumberingAfterBreak="0">
+    <w:nsid w:val="49A458CE"/>
+    <w:multiLevelType w:val="multilevel"/>
+    <w:tmpl w:val="315C0B70"/>
+    <w:lvl w:ilvl="0">
+      <w:start w:val="1"/>
+      <w:numFmt w:val="bullet"/>
+      <w:lvlText w:val=""/>
+      <w:lvlJc w:val="left"/>
+      <w:pPr>
+        <w:tabs>
+          <w:tab w:val="num" w:pos="720"/>
+        </w:tabs>
+        <w:ind w:left="720" w:hanging="360"/>
+      </w:pPr>
+      <w:rPr>
+        <w:rFonts w:ascii="Symbol" w:hAnsi="Symbol" w:hint="default"/>
+        <w:sz w:val="20"/>
+      </w:rPr>
+    </w:lvl>
+    <w:lvl w:ilvl="1" w:tentative="1">
+      <w:start w:val="1"/>
+      <w:numFmt w:val="bullet"/>
+      <w:lvlText w:val="o"/>
+      <w:lvlJc w:val="left"/>
+      <w:pPr>
+        <w:tabs>
+          <w:tab w:val="num" w:pos="1440"/>
+        </w:tabs>
+        <w:ind w:left="1440" w:hanging="360"/>
+      </w:pPr>
+      <w:rPr>
+        <w:rFonts w:ascii="Courier New" w:hAnsi="Courier New" w:hint="default"/>
+        <w:sz w:val="20"/>
+      </w:rPr>
+    </w:lvl>
+    <w:lvl w:ilvl="2" w:tentative="1">
+      <w:start w:val="1"/>
+      <w:numFmt w:val="bullet"/>
+      <w:lvlText w:val=""/>
+      <w:lvlJc w:val="left"/>
+      <w:pPr>
+        <w:tabs>
+          <w:tab w:val="num" w:pos="2160"/>
+        </w:tabs>
+        <w:ind w:left="2160" w:hanging="360"/>
+      </w:pPr>
+      <w:rPr>
+        <w:rFonts w:ascii="Wingdings" w:hAnsi="Wingdings" w:hint="default"/>
+        <w:sz w:val="20"/>
+      </w:rPr>
+    </w:lvl>
+    <w:lvl w:ilvl="3" w:tentative="1">
+      <w:start w:val="1"/>
+      <w:numFmt w:val="bullet"/>
+      <w:lvlText w:val=""/>
+      <w:lvlJc w:val="left"/>
+      <w:pPr>
+        <w:tabs>
+          <w:tab w:val="num" w:pos="2880"/>
+        </w:tabs>
+        <w:ind w:left="2880" w:hanging="360"/>
+      </w:pPr>
+      <w:rPr>
+        <w:rFonts w:ascii="Wingdings" w:hAnsi="Wingdings" w:hint="default"/>
+        <w:sz w:val="20"/>
+      </w:rPr>
+    </w:lvl>
+    <w:lvl w:ilvl="4" w:tentative="1">
+      <w:start w:val="1"/>
+      <w:numFmt w:val="bullet"/>
+      <w:lvlText w:val=""/>
+      <w:lvlJc w:val="left"/>
+      <w:pPr>
+        <w:tabs>
+          <w:tab w:val="num" w:pos="3600"/>
+        </w:tabs>
+        <w:ind w:left="3600" w:hanging="360"/>
+      </w:pPr>
+      <w:rPr>
+        <w:rFonts w:ascii="Wingdings" w:hAnsi="Wingdings" w:hint="default"/>
+        <w:sz w:val="20"/>
+      </w:rPr>
+    </w:lvl>
+    <w:lvl w:ilvl="5" w:tentative="1">
+      <w:start w:val="1"/>
+      <w:numFmt w:val="bullet"/>
+      <w:lvlText w:val=""/>
+      <w:lvlJc w:val="left"/>
+      <w:pPr>
+        <w:tabs>
+          <w:tab w:val="num" w:pos="4320"/>
+        </w:tabs>
+        <w:ind w:left="4320" w:hanging="360"/>
+      </w:pPr>
+      <w:rPr>
+        <w:rFonts w:ascii="Wingdings" w:hAnsi="Wingdings" w:hint="default"/>
+        <w:sz w:val="20"/>
+      </w:rPr>
+    </w:lvl>
+    <w:lvl w:ilvl="6" w:tentative="1">
+      <w:start w:val="1"/>
+      <w:numFmt w:val="bullet"/>
+      <w:lvlText w:val=""/>
+      <w:lvlJc w:val="left"/>
+      <w:pPr>
+        <w:tabs>
+          <w:tab w:val="num" w:pos="5040"/>
+        </w:tabs>
+        <w:ind w:left="5040" w:hanging="360"/>
+      </w:pPr>
+      <w:rPr>
+        <w:rFonts w:ascii="Wingdings" w:hAnsi="Wingdings" w:hint="default"/>
+        <w:sz w:val="20"/>
+      </w:rPr>
+    </w:lvl>
+    <w:lvl w:ilvl="7" w:tentative="1">
+      <w:start w:val="1"/>
+      <w:numFmt w:val="bullet"/>
+      <w:lvlText w:val=""/>
+      <w:lvlJc w:val="left"/>
+      <w:pPr>
+        <w:tabs>
+          <w:tab w:val="num" w:pos="5760"/>
+        </w:tabs>
+        <w:ind w:left="5760" w:hanging="360"/>
+      </w:pPr>
+      <w:rPr>
+        <w:rFonts w:ascii="Wingdings" w:hAnsi="Wingdings" w:hint="default"/>
+        <w:sz w:val="20"/>
+      </w:rPr>
+    </w:lvl>
+    <w:lvl w:ilvl="8" w:tentative="1">
+      <w:start w:val="1"/>
+      <w:numFmt w:val="bullet"/>
+      <w:lvlText w:val=""/>
+      <w:lvlJc w:val="left"/>
+      <w:pPr>
+        <w:tabs>
+          <w:tab w:val="num" w:pos="6480"/>
+        </w:tabs>
+        <w:ind w:left="6480" w:hanging="360"/>
+      </w:pPr>
+      <w:rPr>
+        <w:rFonts w:ascii="Wingdings" w:hAnsi="Wingdings" w:hint="default"/>
+        <w:sz w:val="20"/>
+      </w:rPr>
+    </w:lvl>
+  </w:abstractNum>
+  <w:abstractNum w:abstractNumId="14" w15:restartNumberingAfterBreak="0">
+    <w:nsid w:val="4CC01FFD"/>
+    <w:multiLevelType w:val="multilevel"/>
+    <w:tmpl w:val="CC848BE4"/>
+    <w:lvl w:ilvl="0">
+      <w:start w:val="1"/>
+      <w:numFmt w:val="bullet"/>
+      <w:lvlText w:val=""/>
+      <w:lvlJc w:val="left"/>
+      <w:pPr>
+        <w:tabs>
+          <w:tab w:val="num" w:pos="720"/>
+        </w:tabs>
+        <w:ind w:left="720" w:hanging="360"/>
+      </w:pPr>
+      <w:rPr>
+        <w:rFonts w:ascii="Symbol" w:hAnsi="Symbol" w:hint="default"/>
+        <w:sz w:val="20"/>
+      </w:rPr>
+    </w:lvl>
+    <w:lvl w:ilvl="1" w:tentative="1">
+      <w:start w:val="1"/>
+      <w:numFmt w:val="bullet"/>
+      <w:lvlText w:val="o"/>
+      <w:lvlJc w:val="left"/>
+      <w:pPr>
+        <w:tabs>
+          <w:tab w:val="num" w:pos="1440"/>
+        </w:tabs>
+        <w:ind w:left="1440" w:hanging="360"/>
+      </w:pPr>
+      <w:rPr>
+        <w:rFonts w:ascii="Courier New" w:hAnsi="Courier New" w:hint="default"/>
+        <w:sz w:val="20"/>
+      </w:rPr>
+    </w:lvl>
+    <w:lvl w:ilvl="2" w:tentative="1">
+      <w:start w:val="1"/>
+      <w:numFmt w:val="bullet"/>
+      <w:lvlText w:val=""/>
+      <w:lvlJc w:val="left"/>
+      <w:pPr>
+        <w:tabs>
+          <w:tab w:val="num" w:pos="2160"/>
+        </w:tabs>
+        <w:ind w:left="2160" w:hanging="360"/>
+      </w:pPr>
+      <w:rPr>
+        <w:rFonts w:ascii="Wingdings" w:hAnsi="Wingdings" w:hint="default"/>
+        <w:sz w:val="20"/>
+      </w:rPr>
+    </w:lvl>
+    <w:lvl w:ilvl="3" w:tentative="1">
+      <w:start w:val="1"/>
+      <w:numFmt w:val="bullet"/>
+      <w:lvlText w:val=""/>
+      <w:lvlJc w:val="left"/>
+      <w:pPr>
+        <w:tabs>
+          <w:tab w:val="num" w:pos="2880"/>
+        </w:tabs>
+        <w:ind w:left="2880" w:hanging="360"/>
+      </w:pPr>
+      <w:rPr>
+        <w:rFonts w:ascii="Wingdings" w:hAnsi="Wingdings" w:hint="default"/>
+        <w:sz w:val="20"/>
+      </w:rPr>
+    </w:lvl>
+    <w:lvl w:ilvl="4" w:tentative="1">
+      <w:start w:val="1"/>
+      <w:numFmt w:val="bullet"/>
+      <w:lvlText w:val=""/>
+      <w:lvlJc w:val="left"/>
+      <w:pPr>
+        <w:tabs>
+          <w:tab w:val="num" w:pos="3600"/>
+        </w:tabs>
+        <w:ind w:left="3600" w:hanging="360"/>
+      </w:pPr>
+      <w:rPr>
+        <w:rFonts w:ascii="Wingdings" w:hAnsi="Wingdings" w:hint="default"/>
+        <w:sz w:val="20"/>
+      </w:rPr>
+    </w:lvl>
+    <w:lvl w:ilvl="5" w:tentative="1">
+      <w:start w:val="1"/>
+      <w:numFmt w:val="bullet"/>
+      <w:lvlText w:val=""/>
+      <w:lvlJc w:val="left"/>
+      <w:pPr>
+        <w:tabs>
+          <w:tab w:val="num" w:pos="4320"/>
+        </w:tabs>
+        <w:ind w:left="4320" w:hanging="360"/>
+      </w:pPr>
+      <w:rPr>
+        <w:rFonts w:ascii="Wingdings" w:hAnsi="Wingdings" w:hint="default"/>
+        <w:sz w:val="20"/>
+      </w:rPr>
+    </w:lvl>
+    <w:lvl w:ilvl="6" w:tentative="1">
+      <w:start w:val="1"/>
+      <w:numFmt w:val="bullet"/>
+      <w:lvlText w:val=""/>
+      <w:lvlJc w:val="left"/>
+      <w:pPr>
+        <w:tabs>
+          <w:tab w:val="num" w:pos="5040"/>
+        </w:tabs>
+        <w:ind w:left="5040" w:hanging="360"/>
+      </w:pPr>
+      <w:rPr>
+        <w:rFonts w:ascii="Wingdings" w:hAnsi="Wingdings" w:hint="default"/>
+        <w:sz w:val="20"/>
+      </w:rPr>
+    </w:lvl>
+    <w:lvl w:ilvl="7" w:tentative="1">
+      <w:start w:val="1"/>
+      <w:numFmt w:val="bullet"/>
+      <w:lvlText w:val=""/>
+      <w:lvlJc w:val="left"/>
+      <w:pPr>
+        <w:tabs>
+          <w:tab w:val="num" w:pos="5760"/>
+        </w:tabs>
+        <w:ind w:left="5760" w:hanging="360"/>
+      </w:pPr>
+      <w:rPr>
+        <w:rFonts w:ascii="Wingdings" w:hAnsi="Wingdings" w:hint="default"/>
+        <w:sz w:val="20"/>
+      </w:rPr>
+    </w:lvl>
+    <w:lvl w:ilvl="8" w:tentative="1">
+      <w:start w:val="1"/>
+      <w:numFmt w:val="bullet"/>
+      <w:lvlText w:val=""/>
+      <w:lvlJc w:val="left"/>
+      <w:pPr>
+        <w:tabs>
+          <w:tab w:val="num" w:pos="6480"/>
+        </w:tabs>
+        <w:ind w:left="6480" w:hanging="360"/>
+      </w:pPr>
+      <w:rPr>
+        <w:rFonts w:ascii="Wingdings" w:hAnsi="Wingdings" w:hint="default"/>
+        <w:sz w:val="20"/>
+      </w:rPr>
+    </w:lvl>
+  </w:abstractNum>
+  <w:abstractNum w:abstractNumId="15" w15:restartNumberingAfterBreak="0">
+    <w:nsid w:val="4F95578A"/>
+    <w:multiLevelType w:val="multilevel"/>
+    <w:tmpl w:val="1BFE32F6"/>
+    <w:lvl w:ilvl="0">
+      <w:start w:val="1"/>
+      <w:numFmt w:val="bullet"/>
+      <w:lvlText w:val=""/>
+      <w:lvlJc w:val="left"/>
+      <w:pPr>
+        <w:tabs>
+          <w:tab w:val="num" w:pos="720"/>
+        </w:tabs>
+        <w:ind w:left="720" w:hanging="360"/>
+      </w:pPr>
+      <w:rPr>
+        <w:rFonts w:ascii="Symbol" w:hAnsi="Symbol" w:hint="default"/>
+        <w:sz w:val="20"/>
+      </w:rPr>
+    </w:lvl>
+    <w:lvl w:ilvl="1" w:tentative="1">
+      <w:start w:val="1"/>
+      <w:numFmt w:val="bullet"/>
+      <w:lvlText w:val="o"/>
+      <w:lvlJc w:val="left"/>
+      <w:pPr>
+        <w:tabs>
+          <w:tab w:val="num" w:pos="1440"/>
+        </w:tabs>
+        <w:ind w:left="1440" w:hanging="360"/>
+      </w:pPr>
+      <w:rPr>
+        <w:rFonts w:ascii="Courier New" w:hAnsi="Courier New" w:hint="default"/>
+        <w:sz w:val="20"/>
+      </w:rPr>
+    </w:lvl>
+    <w:lvl w:ilvl="2" w:tentative="1">
+      <w:start w:val="1"/>
+      <w:numFmt w:val="bullet"/>
+      <w:lvlText w:val=""/>
+      <w:lvlJc w:val="left"/>
+      <w:pPr>
+        <w:tabs>
+          <w:tab w:val="num" w:pos="2160"/>
+        </w:tabs>
+        <w:ind w:left="2160" w:hanging="360"/>
+      </w:pPr>
+      <w:rPr>
+        <w:rFonts w:ascii="Wingdings" w:hAnsi="Wingdings" w:hint="default"/>
+        <w:sz w:val="20"/>
+      </w:rPr>
+    </w:lvl>
+    <w:lvl w:ilvl="3" w:tentative="1">
+      <w:start w:val="1"/>
+      <w:numFmt w:val="bullet"/>
+      <w:lvlText w:val=""/>
+      <w:lvlJc w:val="left"/>
+      <w:pPr>
+        <w:tabs>
+          <w:tab w:val="num" w:pos="2880"/>
+        </w:tabs>
+        <w:ind w:left="2880" w:hanging="360"/>
+      </w:pPr>
+      <w:rPr>
+        <w:rFonts w:ascii="Wingdings" w:hAnsi="Wingdings" w:hint="default"/>
+        <w:sz w:val="20"/>
+      </w:rPr>
+    </w:lvl>
+    <w:lvl w:ilvl="4" w:tentative="1">
+      <w:start w:val="1"/>
+      <w:numFmt w:val="bullet"/>
+      <w:lvlText w:val=""/>
+      <w:lvlJc w:val="left"/>
+      <w:pPr>
+        <w:tabs>
+          <w:tab w:val="num" w:pos="3600"/>
+        </w:tabs>
+        <w:ind w:left="3600" w:hanging="360"/>
+      </w:pPr>
+      <w:rPr>
+        <w:rFonts w:ascii="Wingdings" w:hAnsi="Wingdings" w:hint="default"/>
+        <w:sz w:val="20"/>
+      </w:rPr>
+    </w:lvl>
+    <w:lvl w:ilvl="5" w:tentative="1">
+      <w:start w:val="1"/>
+      <w:numFmt w:val="bullet"/>
+      <w:lvlText w:val=""/>
+      <w:lvlJc w:val="left"/>
+      <w:pPr>
+        <w:tabs>
+          <w:tab w:val="num" w:pos="4320"/>
+        </w:tabs>
+        <w:ind w:left="4320" w:hanging="360"/>
+      </w:pPr>
+      <w:rPr>
+        <w:rFonts w:ascii="Wingdings" w:hAnsi="Wingdings" w:hint="default"/>
+        <w:sz w:val="20"/>
+      </w:rPr>
+    </w:lvl>
+    <w:lvl w:ilvl="6" w:tentative="1">
+      <w:start w:val="1"/>
+      <w:numFmt w:val="bullet"/>
+      <w:lvlText w:val=""/>
+      <w:lvlJc w:val="left"/>
+      <w:pPr>
+        <w:tabs>
+          <w:tab w:val="num" w:pos="5040"/>
+        </w:tabs>
+        <w:ind w:left="5040" w:hanging="360"/>
+      </w:pPr>
+      <w:rPr>
+        <w:rFonts w:ascii="Wingdings" w:hAnsi="Wingdings" w:hint="default"/>
+        <w:sz w:val="20"/>
+      </w:rPr>
+    </w:lvl>
+    <w:lvl w:ilvl="7" w:tentative="1">
+      <w:start w:val="1"/>
+      <w:numFmt w:val="bullet"/>
+      <w:lvlText w:val=""/>
+      <w:lvlJc w:val="left"/>
+      <w:pPr>
+        <w:tabs>
+          <w:tab w:val="num" w:pos="5760"/>
+        </w:tabs>
+        <w:ind w:left="5760" w:hanging="360"/>
+      </w:pPr>
+      <w:rPr>
+        <w:rFonts w:ascii="Wingdings" w:hAnsi="Wingdings" w:hint="default"/>
+        <w:sz w:val="20"/>
+      </w:rPr>
+    </w:lvl>
+    <w:lvl w:ilvl="8" w:tentative="1">
+      <w:start w:val="1"/>
+      <w:numFmt w:val="bullet"/>
+      <w:lvlText w:val=""/>
+      <w:lvlJc w:val="left"/>
+      <w:pPr>
+        <w:tabs>
+          <w:tab w:val="num" w:pos="6480"/>
+        </w:tabs>
+        <w:ind w:left="6480" w:hanging="360"/>
+      </w:pPr>
+      <w:rPr>
+        <w:rFonts w:ascii="Wingdings" w:hAnsi="Wingdings" w:hint="default"/>
+        <w:sz w:val="20"/>
+      </w:rPr>
+    </w:lvl>
+  </w:abstractNum>
+  <w:abstractNum w:abstractNumId="16" w15:restartNumberingAfterBreak="0">
+    <w:nsid w:val="5188278E"/>
+    <w:multiLevelType w:val="multilevel"/>
+    <w:tmpl w:val="6310C0F8"/>
+    <w:lvl w:ilvl="0">
+      <w:start w:val="1"/>
+      <w:numFmt w:val="bullet"/>
+      <w:lvlText w:val=""/>
+      <w:lvlJc w:val="left"/>
+      <w:pPr>
+        <w:tabs>
+          <w:tab w:val="num" w:pos="720"/>
+        </w:tabs>
+        <w:ind w:left="720" w:hanging="360"/>
+      </w:pPr>
+      <w:rPr>
+        <w:rFonts w:ascii="Symbol" w:hAnsi="Symbol" w:hint="default"/>
+        <w:sz w:val="20"/>
+      </w:rPr>
+    </w:lvl>
+    <w:lvl w:ilvl="1" w:tentative="1">
+      <w:start w:val="1"/>
+      <w:numFmt w:val="bullet"/>
+      <w:lvlText w:val="o"/>
+      <w:lvlJc w:val="left"/>
+      <w:pPr>
+        <w:tabs>
+          <w:tab w:val="num" w:pos="1440"/>
+        </w:tabs>
+        <w:ind w:left="1440" w:hanging="360"/>
+      </w:pPr>
+      <w:rPr>
+        <w:rFonts w:ascii="Courier New" w:hAnsi="Courier New" w:hint="default"/>
+        <w:sz w:val="20"/>
+      </w:rPr>
+    </w:lvl>
+    <w:lvl w:ilvl="2" w:tentative="1">
+      <w:start w:val="1"/>
+      <w:numFmt w:val="bullet"/>
+      <w:lvlText w:val=""/>
+      <w:lvlJc w:val="left"/>
+      <w:pPr>
+        <w:tabs>
+          <w:tab w:val="num" w:pos="2160"/>
+        </w:tabs>
+        <w:ind w:left="2160" w:hanging="360"/>
+      </w:pPr>
+      <w:rPr>
+        <w:rFonts w:ascii="Wingdings" w:hAnsi="Wingdings" w:hint="default"/>
+        <w:sz w:val="20"/>
+      </w:rPr>
+    </w:lvl>
+    <w:lvl w:ilvl="3" w:tentative="1">
+      <w:start w:val="1"/>
+      <w:numFmt w:val="bullet"/>
+      <w:lvlText w:val=""/>
+      <w:lvlJc w:val="left"/>
+      <w:pPr>
+        <w:tabs>
+          <w:tab w:val="num" w:pos="2880"/>
+        </w:tabs>
+        <w:ind w:left="2880" w:hanging="360"/>
+      </w:pPr>
+      <w:rPr>
+        <w:rFonts w:ascii="Wingdings" w:hAnsi="Wingdings" w:hint="default"/>
+        <w:sz w:val="20"/>
+      </w:rPr>
+    </w:lvl>
+    <w:lvl w:ilvl="4" w:tentative="1">
+      <w:start w:val="1"/>
+      <w:numFmt w:val="bullet"/>
+      <w:lvlText w:val=""/>
+      <w:lvlJc w:val="left"/>
+      <w:pPr>
+        <w:tabs>
+          <w:tab w:val="num" w:pos="3600"/>
+        </w:tabs>
+        <w:ind w:left="3600" w:hanging="360"/>
+      </w:pPr>
+      <w:rPr>
+        <w:rFonts w:ascii="Wingdings" w:hAnsi="Wingdings" w:hint="default"/>
+        <w:sz w:val="20"/>
+      </w:rPr>
+    </w:lvl>
+    <w:lvl w:ilvl="5" w:tentative="1">
+      <w:start w:val="1"/>
+      <w:numFmt w:val="bullet"/>
+      <w:lvlText w:val=""/>
+      <w:lvlJc w:val="left"/>
+      <w:pPr>
+        <w:tabs>
+          <w:tab w:val="num" w:pos="4320"/>
+        </w:tabs>
+        <w:ind w:left="4320" w:hanging="360"/>
+      </w:pPr>
+      <w:rPr>
+        <w:rFonts w:ascii="Wingdings" w:hAnsi="Wingdings" w:hint="default"/>
+        <w:sz w:val="20"/>
+      </w:rPr>
+    </w:lvl>
+    <w:lvl w:ilvl="6" w:tentative="1">
+      <w:start w:val="1"/>
+      <w:numFmt w:val="bullet"/>
+      <w:lvlText w:val=""/>
+      <w:lvlJc w:val="left"/>
+      <w:pPr>
+        <w:tabs>
+          <w:tab w:val="num" w:pos="5040"/>
+        </w:tabs>
+        <w:ind w:left="5040" w:hanging="360"/>
+      </w:pPr>
+      <w:rPr>
+        <w:rFonts w:ascii="Wingdings" w:hAnsi="Wingdings" w:hint="default"/>
+        <w:sz w:val="20"/>
+      </w:rPr>
+    </w:lvl>
+    <w:lvl w:ilvl="7" w:tentative="1">
+      <w:start w:val="1"/>
+      <w:numFmt w:val="bullet"/>
+      <w:lvlText w:val=""/>
+      <w:lvlJc w:val="left"/>
+      <w:pPr>
+        <w:tabs>
+          <w:tab w:val="num" w:pos="5760"/>
+        </w:tabs>
+        <w:ind w:left="5760" w:hanging="360"/>
+      </w:pPr>
+      <w:rPr>
+        <w:rFonts w:ascii="Wingdings" w:hAnsi="Wingdings" w:hint="default"/>
+        <w:sz w:val="20"/>
+      </w:rPr>
+    </w:lvl>
+    <w:lvl w:ilvl="8" w:tentative="1">
+      <w:start w:val="1"/>
+      <w:numFmt w:val="bullet"/>
+      <w:lvlText w:val=""/>
+      <w:lvlJc w:val="left"/>
+      <w:pPr>
+        <w:tabs>
+          <w:tab w:val="num" w:pos="6480"/>
+        </w:tabs>
+        <w:ind w:left="6480" w:hanging="360"/>
+      </w:pPr>
+      <w:rPr>
+        <w:rFonts w:ascii="Wingdings" w:hAnsi="Wingdings" w:hint="default"/>
+        <w:sz w:val="20"/>
+      </w:rPr>
+    </w:lvl>
+  </w:abstractNum>
+  <w:abstractNum w:abstractNumId="17" w15:restartNumberingAfterBreak="0">
+    <w:nsid w:val="53DC730C"/>
+    <w:multiLevelType w:val="multilevel"/>
+    <w:tmpl w:val="E3B6449A"/>
+    <w:lvl w:ilvl="0">
+      <w:start w:val="1"/>
+      <w:numFmt w:val="bullet"/>
+      <w:lvlText w:val=""/>
+      <w:lvlJc w:val="left"/>
+      <w:pPr>
+        <w:tabs>
+          <w:tab w:val="num" w:pos="720"/>
+        </w:tabs>
+        <w:ind w:left="720" w:hanging="360"/>
+      </w:pPr>
+      <w:rPr>
+        <w:rFonts w:ascii="Symbol" w:hAnsi="Symbol" w:hint="default"/>
+        <w:sz w:val="20"/>
+      </w:rPr>
+    </w:lvl>
+    <w:lvl w:ilvl="1" w:tentative="1">
+      <w:start w:val="1"/>
+      <w:numFmt w:val="bullet"/>
+      <w:lvlText w:val="o"/>
+      <w:lvlJc w:val="left"/>
+      <w:pPr>
+        <w:tabs>
+          <w:tab w:val="num" w:pos="1440"/>
+        </w:tabs>
+        <w:ind w:left="1440" w:hanging="360"/>
+      </w:pPr>
+      <w:rPr>
+        <w:rFonts w:ascii="Courier New" w:hAnsi="Courier New" w:hint="default"/>
+        <w:sz w:val="20"/>
+      </w:rPr>
+    </w:lvl>
+    <w:lvl w:ilvl="2" w:tentative="1">
+      <w:start w:val="1"/>
+      <w:numFmt w:val="bullet"/>
+      <w:lvlText w:val=""/>
+      <w:lvlJc w:val="left"/>
+      <w:pPr>
+        <w:tabs>
+          <w:tab w:val="num" w:pos="2160"/>
+        </w:tabs>
+        <w:ind w:left="2160" w:hanging="360"/>
+      </w:pPr>
+      <w:rPr>
+        <w:rFonts w:ascii="Wingdings" w:hAnsi="Wingdings" w:hint="default"/>
+        <w:sz w:val="20"/>
+      </w:rPr>
+    </w:lvl>
+    <w:lvl w:ilvl="3" w:tentative="1">
+      <w:start w:val="1"/>
+      <w:numFmt w:val="bullet"/>
+      <w:lvlText w:val=""/>
+      <w:lvlJc w:val="left"/>
+      <w:pPr>
+        <w:tabs>
+          <w:tab w:val="num" w:pos="2880"/>
+        </w:tabs>
+        <w:ind w:left="2880" w:hanging="360"/>
+      </w:pPr>
+      <w:rPr>
+        <w:rFonts w:ascii="Wingdings" w:hAnsi="Wingdings" w:hint="default"/>
+        <w:sz w:val="20"/>
+      </w:rPr>
+    </w:lvl>
+    <w:lvl w:ilvl="4" w:tentative="1">
+      <w:start w:val="1"/>
+      <w:numFmt w:val="bullet"/>
+      <w:lvlText w:val=""/>
+      <w:lvlJc w:val="left"/>
+      <w:pPr>
+        <w:tabs>
+          <w:tab w:val="num" w:pos="3600"/>
+        </w:tabs>
+        <w:ind w:left="3600" w:hanging="360"/>
+      </w:pPr>
+      <w:rPr>
+        <w:rFonts w:ascii="Wingdings" w:hAnsi="Wingdings" w:hint="default"/>
+        <w:sz w:val="20"/>
+      </w:rPr>
+    </w:lvl>
+    <w:lvl w:ilvl="5" w:tentative="1">
+      <w:start w:val="1"/>
+      <w:numFmt w:val="bullet"/>
+      <w:lvlText w:val=""/>
+      <w:lvlJc w:val="left"/>
+      <w:pPr>
+        <w:tabs>
+          <w:tab w:val="num" w:pos="4320"/>
+        </w:tabs>
+        <w:ind w:left="4320" w:hanging="360"/>
+      </w:pPr>
+      <w:rPr>
+        <w:rFonts w:ascii="Wingdings" w:hAnsi="Wingdings" w:hint="default"/>
+        <w:sz w:val="20"/>
+      </w:rPr>
+    </w:lvl>
+    <w:lvl w:ilvl="6" w:tentative="1">
+      <w:start w:val="1"/>
+      <w:numFmt w:val="bullet"/>
+      <w:lvlText w:val=""/>
+      <w:lvlJc w:val="left"/>
+      <w:pPr>
+        <w:tabs>
+          <w:tab w:val="num" w:pos="5040"/>
+        </w:tabs>
+        <w:ind w:left="5040" w:hanging="360"/>
+      </w:pPr>
+      <w:rPr>
+        <w:rFonts w:ascii="Wingdings" w:hAnsi="Wingdings" w:hint="default"/>
+        <w:sz w:val="20"/>
+      </w:rPr>
+    </w:lvl>
+    <w:lvl w:ilvl="7" w:tentative="1">
+      <w:start w:val="1"/>
+      <w:numFmt w:val="bullet"/>
+      <w:lvlText w:val=""/>
+      <w:lvlJc w:val="left"/>
+      <w:pPr>
+        <w:tabs>
+          <w:tab w:val="num" w:pos="5760"/>
+        </w:tabs>
+        <w:ind w:left="5760" w:hanging="360"/>
+      </w:pPr>
+      <w:rPr>
+        <w:rFonts w:ascii="Wingdings" w:hAnsi="Wingdings" w:hint="default"/>
+        <w:sz w:val="20"/>
+      </w:rPr>
+    </w:lvl>
+    <w:lvl w:ilvl="8" w:tentative="1">
+      <w:start w:val="1"/>
+      <w:numFmt w:val="bullet"/>
+      <w:lvlText w:val=""/>
+      <w:lvlJc w:val="left"/>
+      <w:pPr>
+        <w:tabs>
+          <w:tab w:val="num" w:pos="6480"/>
+        </w:tabs>
+        <w:ind w:left="6480" w:hanging="360"/>
+      </w:pPr>
+      <w:rPr>
+        <w:rFonts w:ascii="Wingdings" w:hAnsi="Wingdings" w:hint="default"/>
+        <w:sz w:val="20"/>
+      </w:rPr>
+    </w:lvl>
+  </w:abstractNum>
+  <w:abstractNum w:abstractNumId="18" w15:restartNumberingAfterBreak="0">
     <w:nsid w:val="5B7608BC"/>
     <w:multiLevelType w:val="multilevel"/>
     <w:tmpl w:val="6CAC999C"/>
@@ -2608,7 +4476,156 @@
       </w:rPr>
     </w:lvl>
   </w:abstractNum>
-  <w:abstractNum w:abstractNumId="10" w15:restartNumberingAfterBreak="0">
+  <w:abstractNum w:abstractNumId="19" w15:restartNumberingAfterBreak="0">
+    <w:nsid w:val="5EB502FA"/>
+    <w:multiLevelType w:val="multilevel"/>
+    <w:tmpl w:val="E62CAFD0"/>
+    <w:lvl w:ilvl="0">
+      <w:start w:val="1"/>
+      <w:numFmt w:val="bullet"/>
+      <w:lvlText w:val=""/>
+      <w:lvlJc w:val="left"/>
+      <w:pPr>
+        <w:tabs>
+          <w:tab w:val="num" w:pos="720"/>
+        </w:tabs>
+        <w:ind w:left="720" w:hanging="360"/>
+      </w:pPr>
+      <w:rPr>
+        <w:rFonts w:ascii="Symbol" w:hAnsi="Symbol" w:hint="default"/>
+        <w:sz w:val="20"/>
+      </w:rPr>
+    </w:lvl>
+    <w:lvl w:ilvl="1" w:tentative="1">
+      <w:start w:val="1"/>
+      <w:numFmt w:val="bullet"/>
+      <w:lvlText w:val="o"/>
+      <w:lvlJc w:val="left"/>
+      <w:pPr>
+        <w:tabs>
+          <w:tab w:val="num" w:pos="1440"/>
+        </w:tabs>
+        <w:ind w:left="1440" w:hanging="360"/>
+      </w:pPr>
+      <w:rPr>
+        <w:rFonts w:ascii="Courier New" w:hAnsi="Courier New" w:hint="default"/>
+        <w:sz w:val="20"/>
+      </w:rPr>
+    </w:lvl>
+    <w:lvl w:ilvl="2" w:tentative="1">
+      <w:start w:val="1"/>
+      <w:numFmt w:val="bullet"/>
+      <w:lvlText w:val=""/>
+      <w:lvlJc w:val="left"/>
+      <w:pPr>
+        <w:tabs>
+          <w:tab w:val="num" w:pos="2160"/>
+        </w:tabs>
+        <w:ind w:left="2160" w:hanging="360"/>
+      </w:pPr>
+      <w:rPr>
+        <w:rFonts w:ascii="Wingdings" w:hAnsi="Wingdings" w:hint="default"/>
+        <w:sz w:val="20"/>
+      </w:rPr>
+    </w:lvl>
+    <w:lvl w:ilvl="3" w:tentative="1">
+      <w:start w:val="1"/>
+      <w:numFmt w:val="bullet"/>
+      <w:lvlText w:val=""/>
+      <w:lvlJc w:val="left"/>
+      <w:pPr>
+        <w:tabs>
+          <w:tab w:val="num" w:pos="2880"/>
+        </w:tabs>
+        <w:ind w:left="2880" w:hanging="360"/>
+      </w:pPr>
+      <w:rPr>
+        <w:rFonts w:ascii="Wingdings" w:hAnsi="Wingdings" w:hint="default"/>
+        <w:sz w:val="20"/>
+      </w:rPr>
+    </w:lvl>
+    <w:lvl w:ilvl="4" w:tentative="1">
+      <w:start w:val="1"/>
+      <w:numFmt w:val="bullet"/>
+      <w:lvlText w:val=""/>
+      <w:lvlJc w:val="left"/>
+      <w:pPr>
+        <w:tabs>
+          <w:tab w:val="num" w:pos="3600"/>
+        </w:tabs>
+        <w:ind w:left="3600" w:hanging="360"/>
+      </w:pPr>
+      <w:rPr>
+        <w:rFonts w:ascii="Wingdings" w:hAnsi="Wingdings" w:hint="default"/>
+        <w:sz w:val="20"/>
+      </w:rPr>
+    </w:lvl>
+    <w:lvl w:ilvl="5" w:tentative="1">
+      <w:start w:val="1"/>
+      <w:numFmt w:val="bullet"/>
+      <w:lvlText w:val=""/>
+      <w:lvlJc w:val="left"/>
+      <w:pPr>
+        <w:tabs>
+          <w:tab w:val="num" w:pos="4320"/>
+        </w:tabs>
+        <w:ind w:left="4320" w:hanging="360"/>
+      </w:pPr>
+      <w:rPr>
+        <w:rFonts w:ascii="Wingdings" w:hAnsi="Wingdings" w:hint="default"/>
+        <w:sz w:val="20"/>
+      </w:rPr>
+    </w:lvl>
+    <w:lvl w:ilvl="6" w:tentative="1">
+      <w:start w:val="1"/>
+      <w:numFmt w:val="bullet"/>
+      <w:lvlText w:val=""/>
+      <w:lvlJc w:val="left"/>
+      <w:pPr>
+        <w:tabs>
+          <w:tab w:val="num" w:pos="5040"/>
+        </w:tabs>
+        <w:ind w:left="5040" w:hanging="360"/>
+      </w:pPr>
+      <w:rPr>
+        <w:rFonts w:ascii="Wingdings" w:hAnsi="Wingdings" w:hint="default"/>
+        <w:sz w:val="20"/>
+      </w:rPr>
+    </w:lvl>
+    <w:lvl w:ilvl="7" w:tentative="1">
+      <w:start w:val="1"/>
+      <w:numFmt w:val="bullet"/>
+      <w:lvlText w:val=""/>
+      <w:lvlJc w:val="left"/>
+      <w:pPr>
+        <w:tabs>
+          <w:tab w:val="num" w:pos="5760"/>
+        </w:tabs>
+        <w:ind w:left="5760" w:hanging="360"/>
+      </w:pPr>
+      <w:rPr>
+        <w:rFonts w:ascii="Wingdings" w:hAnsi="Wingdings" w:hint="default"/>
+        <w:sz w:val="20"/>
+      </w:rPr>
+    </w:lvl>
+    <w:lvl w:ilvl="8" w:tentative="1">
+      <w:start w:val="1"/>
+      <w:numFmt w:val="bullet"/>
+      <w:lvlText w:val=""/>
+      <w:lvlJc w:val="left"/>
+      <w:pPr>
+        <w:tabs>
+          <w:tab w:val="num" w:pos="6480"/>
+        </w:tabs>
+        <w:ind w:left="6480" w:hanging="360"/>
+      </w:pPr>
+      <w:rPr>
+        <w:rFonts w:ascii="Wingdings" w:hAnsi="Wingdings" w:hint="default"/>
+        <w:sz w:val="20"/>
+      </w:rPr>
+    </w:lvl>
+  </w:abstractNum>
+  <w:abstractNum w:abstractNumId="20" w15:restartNumberingAfterBreak="0">
     <w:nsid w:val="65012AD4"/>
     <w:multiLevelType w:val="multilevel"/>
     <w:tmpl w:val="8D86DB0A"/>
@@ -2757,7 +4774,7 @@
       </w:rPr>
     </w:lvl>
   </w:abstractNum>
-  <w:abstractNum w:abstractNumId="11" w15:restartNumberingAfterBreak="0">
+  <w:abstractNum w:abstractNumId="21" w15:restartNumberingAfterBreak="0">
     <w:nsid w:val="670C04B3"/>
     <w:multiLevelType w:val="multilevel"/>
     <w:tmpl w:val="10AE4D4C"/>
@@ -2906,7 +4923,305 @@
       </w:rPr>
     </w:lvl>
   </w:abstractNum>
-  <w:abstractNum w:abstractNumId="12" w15:restartNumberingAfterBreak="0">
+  <w:abstractNum w:abstractNumId="22" w15:restartNumberingAfterBreak="0">
+    <w:nsid w:val="68E14782"/>
+    <w:multiLevelType w:val="multilevel"/>
+    <w:tmpl w:val="1F2EA770"/>
+    <w:lvl w:ilvl="0">
+      <w:start w:val="1"/>
+      <w:numFmt w:val="bullet"/>
+      <w:lvlText w:val=""/>
+      <w:lvlJc w:val="left"/>
+      <w:pPr>
+        <w:tabs>
+          <w:tab w:val="num" w:pos="720"/>
+        </w:tabs>
+        <w:ind w:left="720" w:hanging="360"/>
+      </w:pPr>
+      <w:rPr>
+        <w:rFonts w:ascii="Symbol" w:hAnsi="Symbol" w:hint="default"/>
+        <w:sz w:val="20"/>
+      </w:rPr>
+    </w:lvl>
+    <w:lvl w:ilvl="1" w:tentative="1">
+      <w:start w:val="1"/>
+      <w:numFmt w:val="bullet"/>
+      <w:lvlText w:val="o"/>
+      <w:lvlJc w:val="left"/>
+      <w:pPr>
+        <w:tabs>
+          <w:tab w:val="num" w:pos="1440"/>
+        </w:tabs>
+        <w:ind w:left="1440" w:hanging="360"/>
+      </w:pPr>
+      <w:rPr>
+        <w:rFonts w:ascii="Courier New" w:hAnsi="Courier New" w:hint="default"/>
+        <w:sz w:val="20"/>
+      </w:rPr>
+    </w:lvl>
+    <w:lvl w:ilvl="2" w:tentative="1">
+      <w:start w:val="1"/>
+      <w:numFmt w:val="bullet"/>
+      <w:lvlText w:val=""/>
+      <w:lvlJc w:val="left"/>
+      <w:pPr>
+        <w:tabs>
+          <w:tab w:val="num" w:pos="2160"/>
+        </w:tabs>
+        <w:ind w:left="2160" w:hanging="360"/>
+      </w:pPr>
+      <w:rPr>
+        <w:rFonts w:ascii="Wingdings" w:hAnsi="Wingdings" w:hint="default"/>
+        <w:sz w:val="20"/>
+      </w:rPr>
+    </w:lvl>
+    <w:lvl w:ilvl="3" w:tentative="1">
+      <w:start w:val="1"/>
+      <w:numFmt w:val="bullet"/>
+      <w:lvlText w:val=""/>
+      <w:lvlJc w:val="left"/>
+      <w:pPr>
+        <w:tabs>
+          <w:tab w:val="num" w:pos="2880"/>
+        </w:tabs>
+        <w:ind w:left="2880" w:hanging="360"/>
+      </w:pPr>
+      <w:rPr>
+        <w:rFonts w:ascii="Wingdings" w:hAnsi="Wingdings" w:hint="default"/>
+        <w:sz w:val="20"/>
+      </w:rPr>
+    </w:lvl>
+    <w:lvl w:ilvl="4" w:tentative="1">
+      <w:start w:val="1"/>
+      <w:numFmt w:val="bullet"/>
+      <w:lvlText w:val=""/>
+      <w:lvlJc w:val="left"/>
+      <w:pPr>
+        <w:tabs>
+          <w:tab w:val="num" w:pos="3600"/>
+        </w:tabs>
+        <w:ind w:left="3600" w:hanging="360"/>
+      </w:pPr>
+      <w:rPr>
+        <w:rFonts w:ascii="Wingdings" w:hAnsi="Wingdings" w:hint="default"/>
+        <w:sz w:val="20"/>
+      </w:rPr>
+    </w:lvl>
+    <w:lvl w:ilvl="5" w:tentative="1">
+      <w:start w:val="1"/>
+      <w:numFmt w:val="bullet"/>
+      <w:lvlText w:val=""/>
+      <w:lvlJc w:val="left"/>
+      <w:pPr>
+        <w:tabs>
+          <w:tab w:val="num" w:pos="4320"/>
+        </w:tabs>
+        <w:ind w:left="4320" w:hanging="360"/>
+      </w:pPr>
+      <w:rPr>
+        <w:rFonts w:ascii="Wingdings" w:hAnsi="Wingdings" w:hint="default"/>
+        <w:sz w:val="20"/>
+      </w:rPr>
+    </w:lvl>
+    <w:lvl w:ilvl="6" w:tentative="1">
+      <w:start w:val="1"/>
+      <w:numFmt w:val="bullet"/>
+      <w:lvlText w:val=""/>
+      <w:lvlJc w:val="left"/>
+      <w:pPr>
+        <w:tabs>
+          <w:tab w:val="num" w:pos="5040"/>
+        </w:tabs>
+        <w:ind w:left="5040" w:hanging="360"/>
+      </w:pPr>
+      <w:rPr>
+        <w:rFonts w:ascii="Wingdings" w:hAnsi="Wingdings" w:hint="default"/>
+        <w:sz w:val="20"/>
+      </w:rPr>
+    </w:lvl>
+    <w:lvl w:ilvl="7" w:tentative="1">
+      <w:start w:val="1"/>
+      <w:numFmt w:val="bullet"/>
+      <w:lvlText w:val=""/>
+      <w:lvlJc w:val="left"/>
+      <w:pPr>
+        <w:tabs>
+          <w:tab w:val="num" w:pos="5760"/>
+        </w:tabs>
+        <w:ind w:left="5760" w:hanging="360"/>
+      </w:pPr>
+      <w:rPr>
+        <w:rFonts w:ascii="Wingdings" w:hAnsi="Wingdings" w:hint="default"/>
+        <w:sz w:val="20"/>
+      </w:rPr>
+    </w:lvl>
+    <w:lvl w:ilvl="8" w:tentative="1">
+      <w:start w:val="1"/>
+      <w:numFmt w:val="bullet"/>
+      <w:lvlText w:val=""/>
+      <w:lvlJc w:val="left"/>
+      <w:pPr>
+        <w:tabs>
+          <w:tab w:val="num" w:pos="6480"/>
+        </w:tabs>
+        <w:ind w:left="6480" w:hanging="360"/>
+      </w:pPr>
+      <w:rPr>
+        <w:rFonts w:ascii="Wingdings" w:hAnsi="Wingdings" w:hint="default"/>
+        <w:sz w:val="20"/>
+      </w:rPr>
+    </w:lvl>
+  </w:abstractNum>
+  <w:abstractNum w:abstractNumId="23" w15:restartNumberingAfterBreak="0">
+    <w:nsid w:val="700C3D0A"/>
+    <w:multiLevelType w:val="multilevel"/>
+    <w:tmpl w:val="E4F2C0B6"/>
+    <w:lvl w:ilvl="0">
+      <w:start w:val="1"/>
+      <w:numFmt w:val="bullet"/>
+      <w:lvlText w:val=""/>
+      <w:lvlJc w:val="left"/>
+      <w:pPr>
+        <w:tabs>
+          <w:tab w:val="num" w:pos="720"/>
+        </w:tabs>
+        <w:ind w:left="720" w:hanging="360"/>
+      </w:pPr>
+      <w:rPr>
+        <w:rFonts w:ascii="Symbol" w:hAnsi="Symbol" w:hint="default"/>
+        <w:sz w:val="20"/>
+      </w:rPr>
+    </w:lvl>
+    <w:lvl w:ilvl="1" w:tentative="1">
+      <w:start w:val="1"/>
+      <w:numFmt w:val="bullet"/>
+      <w:lvlText w:val="o"/>
+      <w:lvlJc w:val="left"/>
+      <w:pPr>
+        <w:tabs>
+          <w:tab w:val="num" w:pos="1440"/>
+        </w:tabs>
+        <w:ind w:left="1440" w:hanging="360"/>
+      </w:pPr>
+      <w:rPr>
+        <w:rFonts w:ascii="Courier New" w:hAnsi="Courier New" w:hint="default"/>
+        <w:sz w:val="20"/>
+      </w:rPr>
+    </w:lvl>
+    <w:lvl w:ilvl="2" w:tentative="1">
+      <w:start w:val="1"/>
+      <w:numFmt w:val="bullet"/>
+      <w:lvlText w:val=""/>
+      <w:lvlJc w:val="left"/>
+      <w:pPr>
+        <w:tabs>
+          <w:tab w:val="num" w:pos="2160"/>
+        </w:tabs>
+        <w:ind w:left="2160" w:hanging="360"/>
+      </w:pPr>
+      <w:rPr>
+        <w:rFonts w:ascii="Wingdings" w:hAnsi="Wingdings" w:hint="default"/>
+        <w:sz w:val="20"/>
+      </w:rPr>
+    </w:lvl>
+    <w:lvl w:ilvl="3" w:tentative="1">
+      <w:start w:val="1"/>
+      <w:numFmt w:val="bullet"/>
+      <w:lvlText w:val=""/>
+      <w:lvlJc w:val="left"/>
+      <w:pPr>
+        <w:tabs>
+          <w:tab w:val="num" w:pos="2880"/>
+        </w:tabs>
+        <w:ind w:left="2880" w:hanging="360"/>
+      </w:pPr>
+      <w:rPr>
+        <w:rFonts w:ascii="Wingdings" w:hAnsi="Wingdings" w:hint="default"/>
+        <w:sz w:val="20"/>
+      </w:rPr>
+    </w:lvl>
+    <w:lvl w:ilvl="4" w:tentative="1">
+      <w:start w:val="1"/>
+      <w:numFmt w:val="bullet"/>
+      <w:lvlText w:val=""/>
+      <w:lvlJc w:val="left"/>
+      <w:pPr>
+        <w:tabs>
+          <w:tab w:val="num" w:pos="3600"/>
+        </w:tabs>
+        <w:ind w:left="3600" w:hanging="360"/>
+      </w:pPr>
+      <w:rPr>
+        <w:rFonts w:ascii="Wingdings" w:hAnsi="Wingdings" w:hint="default"/>
+        <w:sz w:val="20"/>
+      </w:rPr>
+    </w:lvl>
+    <w:lvl w:ilvl="5" w:tentative="1">
+      <w:start w:val="1"/>
+      <w:numFmt w:val="bullet"/>
+      <w:lvlText w:val=""/>
+      <w:lvlJc w:val="left"/>
+      <w:pPr>
+        <w:tabs>
+          <w:tab w:val="num" w:pos="4320"/>
+        </w:tabs>
+        <w:ind w:left="4320" w:hanging="360"/>
+      </w:pPr>
+      <w:rPr>
+        <w:rFonts w:ascii="Wingdings" w:hAnsi="Wingdings" w:hint="default"/>
+        <w:sz w:val="20"/>
+      </w:rPr>
+    </w:lvl>
+    <w:lvl w:ilvl="6" w:tentative="1">
+      <w:start w:val="1"/>
+      <w:numFmt w:val="bullet"/>
+      <w:lvlText w:val=""/>
+      <w:lvlJc w:val="left"/>
+      <w:pPr>
+        <w:tabs>
+          <w:tab w:val="num" w:pos="5040"/>
+        </w:tabs>
+        <w:ind w:left="5040" w:hanging="360"/>
+      </w:pPr>
+      <w:rPr>
+        <w:rFonts w:ascii="Wingdings" w:hAnsi="Wingdings" w:hint="default"/>
+        <w:sz w:val="20"/>
+      </w:rPr>
+    </w:lvl>
+    <w:lvl w:ilvl="7" w:tentative="1">
+      <w:start w:val="1"/>
+      <w:numFmt w:val="bullet"/>
+      <w:lvlText w:val=""/>
+      <w:lvlJc w:val="left"/>
+      <w:pPr>
+        <w:tabs>
+          <w:tab w:val="num" w:pos="5760"/>
+        </w:tabs>
+        <w:ind w:left="5760" w:hanging="360"/>
+      </w:pPr>
+      <w:rPr>
+        <w:rFonts w:ascii="Wingdings" w:hAnsi="Wingdings" w:hint="default"/>
+        <w:sz w:val="20"/>
+      </w:rPr>
+    </w:lvl>
+    <w:lvl w:ilvl="8" w:tentative="1">
+      <w:start w:val="1"/>
+      <w:numFmt w:val="bullet"/>
+      <w:lvlText w:val=""/>
+      <w:lvlJc w:val="left"/>
+      <w:pPr>
+        <w:tabs>
+          <w:tab w:val="num" w:pos="6480"/>
+        </w:tabs>
+        <w:ind w:left="6480" w:hanging="360"/>
+      </w:pPr>
+      <w:rPr>
+        <w:rFonts w:ascii="Wingdings" w:hAnsi="Wingdings" w:hint="default"/>
+        <w:sz w:val="20"/>
+      </w:rPr>
+    </w:lvl>
+  </w:abstractNum>
+  <w:abstractNum w:abstractNumId="24" w15:restartNumberingAfterBreak="0">
     <w:nsid w:val="716B6BF4"/>
     <w:multiLevelType w:val="multilevel"/>
     <w:tmpl w:val="630ADCAC"/>
@@ -3055,7 +5370,156 @@
       </w:rPr>
     </w:lvl>
   </w:abstractNum>
-  <w:abstractNum w:abstractNumId="13" w15:restartNumberingAfterBreak="0">
+  <w:abstractNum w:abstractNumId="25" w15:restartNumberingAfterBreak="0">
+    <w:nsid w:val="7C3B3F17"/>
+    <w:multiLevelType w:val="multilevel"/>
+    <w:tmpl w:val="1ED8BC38"/>
+    <w:lvl w:ilvl="0">
+      <w:start w:val="1"/>
+      <w:numFmt w:val="bullet"/>
+      <w:lvlText w:val=""/>
+      <w:lvlJc w:val="left"/>
+      <w:pPr>
+        <w:tabs>
+          <w:tab w:val="num" w:pos="720"/>
+        </w:tabs>
+        <w:ind w:left="720" w:hanging="360"/>
+      </w:pPr>
+      <w:rPr>
+        <w:rFonts w:ascii="Symbol" w:hAnsi="Symbol" w:hint="default"/>
+        <w:sz w:val="20"/>
+      </w:rPr>
+    </w:lvl>
+    <w:lvl w:ilvl="1" w:tentative="1">
+      <w:start w:val="1"/>
+      <w:numFmt w:val="bullet"/>
+      <w:lvlText w:val="o"/>
+      <w:lvlJc w:val="left"/>
+      <w:pPr>
+        <w:tabs>
+          <w:tab w:val="num" w:pos="1440"/>
+        </w:tabs>
+        <w:ind w:left="1440" w:hanging="360"/>
+      </w:pPr>
+      <w:rPr>
+        <w:rFonts w:ascii="Courier New" w:hAnsi="Courier New" w:hint="default"/>
+        <w:sz w:val="20"/>
+      </w:rPr>
+    </w:lvl>
+    <w:lvl w:ilvl="2" w:tentative="1">
+      <w:start w:val="1"/>
+      <w:numFmt w:val="bullet"/>
+      <w:lvlText w:val=""/>
+      <w:lvlJc w:val="left"/>
+      <w:pPr>
+        <w:tabs>
+          <w:tab w:val="num" w:pos="2160"/>
+        </w:tabs>
+        <w:ind w:left="2160" w:hanging="360"/>
+      </w:pPr>
+      <w:rPr>
+        <w:rFonts w:ascii="Wingdings" w:hAnsi="Wingdings" w:hint="default"/>
+        <w:sz w:val="20"/>
+      </w:rPr>
+    </w:lvl>
+    <w:lvl w:ilvl="3" w:tentative="1">
+      <w:start w:val="1"/>
+      <w:numFmt w:val="bullet"/>
+      <w:lvlText w:val=""/>
+      <w:lvlJc w:val="left"/>
+      <w:pPr>
+        <w:tabs>
+          <w:tab w:val="num" w:pos="2880"/>
+        </w:tabs>
+        <w:ind w:left="2880" w:hanging="360"/>
+      </w:pPr>
+      <w:rPr>
+        <w:rFonts w:ascii="Wingdings" w:hAnsi="Wingdings" w:hint="default"/>
+        <w:sz w:val="20"/>
+      </w:rPr>
+    </w:lvl>
+    <w:lvl w:ilvl="4" w:tentative="1">
+      <w:start w:val="1"/>
+      <w:numFmt w:val="bullet"/>
+      <w:lvlText w:val=""/>
+      <w:lvlJc w:val="left"/>
+      <w:pPr>
+        <w:tabs>
+          <w:tab w:val="num" w:pos="3600"/>
+        </w:tabs>
+        <w:ind w:left="3600" w:hanging="360"/>
+      </w:pPr>
+      <w:rPr>
+        <w:rFonts w:ascii="Wingdings" w:hAnsi="Wingdings" w:hint="default"/>
+        <w:sz w:val="20"/>
+      </w:rPr>
+    </w:lvl>
+    <w:lvl w:ilvl="5" w:tentative="1">
+      <w:start w:val="1"/>
+      <w:numFmt w:val="bullet"/>
+      <w:lvlText w:val=""/>
+      <w:lvlJc w:val="left"/>
+      <w:pPr>
+        <w:tabs>
+          <w:tab w:val="num" w:pos="4320"/>
+        </w:tabs>
+        <w:ind w:left="4320" w:hanging="360"/>
+      </w:pPr>
+      <w:rPr>
+        <w:rFonts w:ascii="Wingdings" w:hAnsi="Wingdings" w:hint="default"/>
+        <w:sz w:val="20"/>
+      </w:rPr>
+    </w:lvl>
+    <w:lvl w:ilvl="6" w:tentative="1">
+      <w:start w:val="1"/>
+      <w:numFmt w:val="bullet"/>
+      <w:lvlText w:val=""/>
+      <w:lvlJc w:val="left"/>
+      <w:pPr>
+        <w:tabs>
+          <w:tab w:val="num" w:pos="5040"/>
+        </w:tabs>
+        <w:ind w:left="5040" w:hanging="360"/>
+      </w:pPr>
+      <w:rPr>
+        <w:rFonts w:ascii="Wingdings" w:hAnsi="Wingdings" w:hint="default"/>
+        <w:sz w:val="20"/>
+      </w:rPr>
+    </w:lvl>
+    <w:lvl w:ilvl="7" w:tentative="1">
+      <w:start w:val="1"/>
+      <w:numFmt w:val="bullet"/>
+      <w:lvlText w:val=""/>
+      <w:lvlJc w:val="left"/>
+      <w:pPr>
+        <w:tabs>
+          <w:tab w:val="num" w:pos="5760"/>
+        </w:tabs>
+        <w:ind w:left="5760" w:hanging="360"/>
+      </w:pPr>
+      <w:rPr>
+        <w:rFonts w:ascii="Wingdings" w:hAnsi="Wingdings" w:hint="default"/>
+        <w:sz w:val="20"/>
+      </w:rPr>
+    </w:lvl>
+    <w:lvl w:ilvl="8" w:tentative="1">
+      <w:start w:val="1"/>
+      <w:numFmt w:val="bullet"/>
+      <w:lvlText w:val=""/>
+      <w:lvlJc w:val="left"/>
+      <w:pPr>
+        <w:tabs>
+          <w:tab w:val="num" w:pos="6480"/>
+        </w:tabs>
+        <w:ind w:left="6480" w:hanging="360"/>
+      </w:pPr>
+      <w:rPr>
+        <w:rFonts w:ascii="Wingdings" w:hAnsi="Wingdings" w:hint="default"/>
+        <w:sz w:val="20"/>
+      </w:rPr>
+    </w:lvl>
+  </w:abstractNum>
+  <w:abstractNum w:abstractNumId="26" w15:restartNumberingAfterBreak="0">
     <w:nsid w:val="7C4827D6"/>
     <w:multiLevelType w:val="multilevel"/>
     <w:tmpl w:val="0A0E2D4A"/>
@@ -3205,46 +5669,85 @@
     </w:lvl>
   </w:abstractNum>
   <w:num w:numId="1" w16cid:durableId="1630933917">
-    <w:abstractNumId w:val="6"/>
+    <w:abstractNumId w:val="10"/>
   </w:num>
   <w:num w:numId="2" w16cid:durableId="363021299">
+    <w:abstractNumId w:val="4"/>
+  </w:num>
+  <w:num w:numId="3" w16cid:durableId="1745714188">
     <w:abstractNumId w:val="3"/>
   </w:num>
-  <w:num w:numId="3" w16cid:durableId="1745714188">
-    <w:abstractNumId w:val="2"/>
-  </w:num>
   <w:num w:numId="4" w16cid:durableId="2075807488">
-    <w:abstractNumId w:val="7"/>
+    <w:abstractNumId w:val="11"/>
   </w:num>
   <w:num w:numId="5" w16cid:durableId="1453941516">
     <w:abstractNumId w:val="0"/>
   </w:num>
   <w:num w:numId="6" w16cid:durableId="1060832499">
-    <w:abstractNumId w:val="4"/>
+    <w:abstractNumId w:val="6"/>
   </w:num>
   <w:num w:numId="7" w16cid:durableId="728723898">
     <w:abstractNumId w:val="1"/>
   </w:num>
   <w:num w:numId="8" w16cid:durableId="1776249446">
+    <w:abstractNumId w:val="12"/>
+  </w:num>
+  <w:num w:numId="9" w16cid:durableId="1776974655">
+    <w:abstractNumId w:val="7"/>
+  </w:num>
+  <w:num w:numId="10" w16cid:durableId="1396976922">
+    <w:abstractNumId w:val="20"/>
+  </w:num>
+  <w:num w:numId="11" w16cid:durableId="1999191856">
+    <w:abstractNumId w:val="21"/>
+  </w:num>
+  <w:num w:numId="12" w16cid:durableId="769161677">
+    <w:abstractNumId w:val="18"/>
+  </w:num>
+  <w:num w:numId="13" w16cid:durableId="859782170">
+    <w:abstractNumId w:val="24"/>
+  </w:num>
+  <w:num w:numId="14" w16cid:durableId="2026245438">
+    <w:abstractNumId w:val="26"/>
+  </w:num>
+  <w:num w:numId="15" w16cid:durableId="901017754">
+    <w:abstractNumId w:val="25"/>
+  </w:num>
+  <w:num w:numId="16" w16cid:durableId="1988823040">
+    <w:abstractNumId w:val="5"/>
+  </w:num>
+  <w:num w:numId="17" w16cid:durableId="541095361">
     <w:abstractNumId w:val="8"/>
   </w:num>
-  <w:num w:numId="9" w16cid:durableId="1776974655">
-    <w:abstractNumId w:val="5"/>
+  <w:num w:numId="18" w16cid:durableId="688340650">
+    <w:abstractNumId w:val="15"/>
   </w:num>
-  <w:num w:numId="10" w16cid:durableId="1396976922">
-    <w:abstractNumId w:val="10"/>
+  <w:num w:numId="19" w16cid:durableId="223375082">
+    <w:abstractNumId w:val="17"/>
   </w:num>
-  <w:num w:numId="11" w16cid:durableId="1999191856">
-    <w:abstractNumId w:val="11"/>
+  <w:num w:numId="20" w16cid:durableId="765540141">
+    <w:abstractNumId w:val="19"/>
   </w:num>
-  <w:num w:numId="12" w16cid:durableId="769161677">
+  <w:num w:numId="21" w16cid:durableId="117341674">
+    <w:abstractNumId w:val="22"/>
+  </w:num>
+  <w:num w:numId="22" w16cid:durableId="772555942">
+    <w:abstractNumId w:val="16"/>
+  </w:num>
+  <w:num w:numId="23" w16cid:durableId="282731980">
+    <w:abstractNumId w:val="14"/>
+  </w:num>
+  <w:num w:numId="24" w16cid:durableId="118575385">
+    <w:abstractNumId w:val="13"/>
+  </w:num>
+  <w:num w:numId="25" w16cid:durableId="1187791929">
+    <w:abstractNumId w:val="23"/>
+  </w:num>
+  <w:num w:numId="26" w16cid:durableId="102045327">
+    <w:abstractNumId w:val="2"/>
+  </w:num>
+  <w:num w:numId="27" w16cid:durableId="1752773942">
     <w:abstractNumId w:val="9"/>
-  </w:num>
-  <w:num w:numId="13" w16cid:durableId="859782170">
-    <w:abstractNumId w:val="12"/>
-  </w:num>
-  <w:num w:numId="14" w16cid:durableId="2026245438">
-    <w:abstractNumId w:val="13"/>
   </w:num>
 </w:numbering>
 </file>

</xml_diff>